<commit_message>
Progress in the Introduction
</commit_message>
<xml_diff>
--- a/CA1-ANDREA DIAZ MEDRANO.docx
+++ b/CA1-ANDREA DIAZ MEDRANO.docx
@@ -2070,7 +2070,31 @@
         <w:rPr>
           <w:rFonts w:ascii="Arial" w:hAnsi="Arial" w:cs="Arial"/>
         </w:rPr>
-        <w:t>edictive Analytics for Corporate Carbon Performance: Supporting Strategic Sustainability Decision-Making.</w:t>
+        <w:t xml:space="preserve">edictive Analytics for </w:t>
+      </w:r>
+      <w:r>
+        <w:rPr>
+          <w:rFonts w:ascii="Arial" w:hAnsi="Arial" w:cs="Arial"/>
+        </w:rPr>
+        <w:t>corporate greenhouse gas emissions (tCO</w:t>
+      </w:r>
+      <w:r>
+        <w:rPr>
+          <w:rFonts w:ascii="Cambria Math" w:hAnsi="Cambria Math" w:cs="Cambria Math"/>
+        </w:rPr>
+        <w:t>₂</w:t>
+      </w:r>
+      <w:r>
+        <w:rPr>
+          <w:rFonts w:ascii="Arial" w:hAnsi="Arial" w:cs="Arial"/>
+        </w:rPr>
+        <w:t>e)</w:t>
+      </w:r>
+      <w:r>
+        <w:rPr>
+          <w:rFonts w:ascii="Arial" w:hAnsi="Arial" w:cs="Arial"/>
+        </w:rPr>
+        <w:t>: Supporting Strategic Sustainability Decision-Making.</w:t>
       </w:r>
     </w:p>
     <w:p>
@@ -2081,7 +2105,6 @@
           <w:b/>
           <w:bCs/>
           <w:color w:val="auto"/>
-          <w:lang w:val="pt-BR"/>
         </w:rPr>
       </w:pPr>
       <w:bookmarkStart w:id="2" w:name="_Toc241617504"/>
@@ -2091,7 +2114,6 @@
           <w:b/>
           <w:bCs/>
           <w:color w:val="auto"/>
-          <w:lang w:val="pt-BR"/>
         </w:rPr>
         <w:t>II</w:t>
       </w:r>
@@ -2101,7 +2123,6 @@
           <w:b/>
           <w:bCs/>
           <w:color w:val="auto"/>
-          <w:lang w:val="pt-BR"/>
         </w:rPr>
         <w:t>. Introduction</w:t>
       </w:r>
@@ -2119,21 +2140,7 @@
         <w:rPr>
           <w:rFonts w:ascii="Arial" w:hAnsi="Arial" w:cs="Arial"/>
         </w:rPr>
-        <w:t xml:space="preserve">The Earth's atmosphere is composed of various gases, with nitrogen and oxygen being the most abundant, at concentrations of 78% and 21%, respectively. The remaining 1% includes some gases known as trace gases, such as ozone, </w:t>
-      </w:r>
-      <w:proofErr w:type="spellStart"/>
-      <w:r>
-        <w:rPr>
-          <w:rFonts w:ascii="Arial" w:hAnsi="Arial" w:cs="Arial"/>
-        </w:rPr>
-        <w:t>sulfur</w:t>
-      </w:r>
-      <w:proofErr w:type="spellEnd"/>
-      <w:r>
-        <w:rPr>
-          <w:rFonts w:ascii="Arial" w:hAnsi="Arial" w:cs="Arial"/>
-        </w:rPr>
-        <w:t xml:space="preserve"> dioxide, nitrogen oxides, and carbon dioxide (CO</w:t>
+        <w:t>The Earth's atmosphere is composed of various gases, with nitrogen and oxygen being the most abundant, at concentrations of 78% and 21%, respectively. The remaining 1% includes some gases known as trace gases, such as ozone, sulfur dioxide, nitrogen oxides, and carbon dioxide (CO</w:t>
       </w:r>
       <w:r>
         <w:rPr>
@@ -2145,7 +2152,13 @@
         <w:rPr>
           <w:rFonts w:ascii="Arial" w:hAnsi="Arial" w:cs="Arial"/>
         </w:rPr>
-        <w:t>), which accounts for only about 0.04% of the atmosphere.</w:t>
+        <w:t>)</w:t>
+      </w:r>
+      <w:r>
+        <w:rPr>
+          <w:rFonts w:ascii="Arial" w:hAnsi="Arial" w:cs="Arial"/>
+        </w:rPr>
+        <w:t>.</w:t>
       </w:r>
     </w:p>
     <w:p>
@@ -2160,7 +2173,38 @@
         <w:rPr>
           <w:rFonts w:ascii="Arial" w:hAnsi="Arial" w:cs="Arial"/>
         </w:rPr>
-        <w:t>In other words, CO2 is a gas that forms part of the atmosphere’s natural composition, and its presence is even vital as part of Earth’s carbon cycle</w:t>
+        <w:t xml:space="preserve">The </w:t>
+      </w:r>
+      <w:r>
+        <w:rPr>
+          <w:rFonts w:ascii="Arial" w:hAnsi="Arial" w:cs="Arial"/>
+        </w:rPr>
+        <w:t>CO</w:t>
+      </w:r>
+      <w:r>
+        <w:rPr>
+          <w:rFonts w:ascii="Arial" w:hAnsi="Arial" w:cs="Arial"/>
+          <w:vertAlign w:val="subscript"/>
+        </w:rPr>
+        <w:t>2</w:t>
+      </w:r>
+      <w:r>
+        <w:rPr>
+          <w:rFonts w:ascii="Arial" w:hAnsi="Arial" w:cs="Arial"/>
+        </w:rPr>
+        <w:t xml:space="preserve"> is a gas that forms part of the atmosphere’s natural composition, and its presence is </w:t>
+      </w:r>
+      <w:r>
+        <w:rPr>
+          <w:rFonts w:ascii="Arial" w:hAnsi="Arial" w:cs="Arial"/>
+        </w:rPr>
+        <w:t xml:space="preserve">a </w:t>
+      </w:r>
+      <w:r>
+        <w:rPr>
+          <w:rFonts w:ascii="Arial" w:hAnsi="Arial" w:cs="Arial"/>
+        </w:rPr>
+        <w:t>vital part of Earth’s carbon cycle</w:t>
       </w:r>
       <w:r>
         <w:rPr>
@@ -2228,23 +2272,270 @@
     <w:p>
       <w:pPr>
         <w:pStyle w:val="NormalWeb"/>
-        <w:jc w:val="both"/>
-        <w:rPr>
-          <w:rFonts w:ascii="Arial" w:hAnsi="Arial" w:cs="Arial"/>
-        </w:rPr>
-      </w:pPr>
-      <w:r>
-        <w:rPr>
-          <w:rFonts w:ascii="Arial" w:hAnsi="Arial" w:cs="Arial"/>
-        </w:rPr>
-        <w:tab/>
-      </w:r>
-      <w:r>
-        <w:rPr>
-          <w:rFonts w:ascii="Arial" w:hAnsi="Arial" w:cs="Arial"/>
-        </w:rPr>
-        <w:tab/>
-        <w:t>ADD IMAGEN</w:t>
+        <w:jc w:val="center"/>
+        <w:rPr>
+          <w:rFonts w:ascii="Arial" w:hAnsi="Arial" w:cs="Arial"/>
+        </w:rPr>
+      </w:pPr>
+      <w:r>
+        <w:rPr>
+          <w:noProof/>
+        </w:rPr>
+        <mc:AlternateContent>
+          <mc:Choice Requires="wps">
+            <w:drawing>
+              <wp:inline distT="0" distB="0" distL="0" distR="0" wp14:anchorId="794B1F12" wp14:editId="0237EAA1">
+                <wp:extent cx="304800" cy="304800"/>
+                <wp:effectExtent l="0" t="0" r="0" b="0"/>
+                <wp:docPr id="393063367" name="Rectangle 4" descr="Carbon Cycle"/>
+                <wp:cNvGraphicFramePr>
+                  <a:graphicFrameLocks xmlns:a="http://schemas.openxmlformats.org/drawingml/2006/main" noChangeAspect="1"/>
+                </wp:cNvGraphicFramePr>
+                <a:graphic xmlns:a="http://schemas.openxmlformats.org/drawingml/2006/main">
+                  <a:graphicData uri="http://schemas.microsoft.com/office/word/2010/wordprocessingShape">
+                    <wps:wsp>
+                      <wps:cNvSpPr>
+                        <a:spLocks noChangeAspect="1" noChangeArrowheads="1"/>
+                      </wps:cNvSpPr>
+                      <wps:spPr bwMode="auto">
+                        <a:xfrm>
+                          <a:off x="0" y="0"/>
+                          <a:ext cx="304800" cy="304800"/>
+                        </a:xfrm>
+                        <a:prstGeom prst="rect">
+                          <a:avLst/>
+                        </a:prstGeom>
+                        <a:noFill/>
+                        <a:ln>
+                          <a:noFill/>
+                        </a:ln>
+                        <a:extLst>
+                          <a:ext uri="{909E8E84-426E-40DD-AFC4-6F175D3DCCD1}">
+                            <a14:hiddenFill xmlns:a14="http://schemas.microsoft.com/office/drawing/2010/main">
+                              <a:solidFill>
+                                <a:srgbClr val="FFFFFF"/>
+                              </a:solidFill>
+                            </a14:hiddenFill>
+                          </a:ext>
+                          <a:ext uri="{91240B29-F687-4F45-9708-019B960494DF}">
+                            <a14:hiddenLine xmlns:a14="http://schemas.microsoft.com/office/drawing/2010/main" w="9525">
+                              <a:solidFill>
+                                <a:srgbClr val="000000"/>
+                              </a:solidFill>
+                              <a:miter lim="800000"/>
+                              <a:headEnd/>
+                              <a:tailEnd/>
+                            </a14:hiddenLine>
+                          </a:ext>
+                        </a:extLst>
+                      </wps:spPr>
+                      <wps:bodyPr rot="0" vert="horz" wrap="square" lIns="91440" tIns="45720" rIns="91440" bIns="45720" anchor="t" anchorCtr="0" upright="1">
+                        <a:noAutofit/>
+                      </wps:bodyPr>
+                    </wps:wsp>
+                  </a:graphicData>
+                </a:graphic>
+              </wp:inline>
+            </w:drawing>
+          </mc:Choice>
+          <mc:Fallback>
+            <w:pict>
+              <v:rect w14:anchorId="5D010582" id="Rectangle 4" o:spid="_x0000_s1026" alt="Carbon Cycle" style="width:24pt;height:24pt;visibility:visible;mso-wrap-style:square;mso-left-percent:-10001;mso-top-percent:-10001;mso-position-horizontal:absolute;mso-position-horizontal-relative:char;mso-position-vertical:absolute;mso-position-vertical-relative:line;mso-left-percent:-10001;mso-top-percent:-10001;v-text-anchor:top" o:gfxdata="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" filled="f" stroked="f">
+                <o:lock v:ext="edit" aspectratio="t"/>
+                <w10:anchorlock/>
+              </v:rect>
+            </w:pict>
+          </mc:Fallback>
+        </mc:AlternateContent>
+      </w:r>
+      <w:r>
+        <w:rPr>
+          <w:noProof/>
+        </w:rPr>
+        <mc:AlternateContent>
+          <mc:Choice Requires="wps">
+            <w:drawing>
+              <wp:inline distT="0" distB="0" distL="0" distR="0" wp14:anchorId="04DFE693" wp14:editId="51E2E5C1">
+                <wp:extent cx="304800" cy="304800"/>
+                <wp:effectExtent l="0" t="0" r="0" b="0"/>
+                <wp:docPr id="1709371472" name="Rectangle 5" descr="Carbon Cycle"/>
+                <wp:cNvGraphicFramePr>
+                  <a:graphicFrameLocks xmlns:a="http://schemas.openxmlformats.org/drawingml/2006/main" noChangeAspect="1"/>
+                </wp:cNvGraphicFramePr>
+                <a:graphic xmlns:a="http://schemas.openxmlformats.org/drawingml/2006/main">
+                  <a:graphicData uri="http://schemas.microsoft.com/office/word/2010/wordprocessingShape">
+                    <wps:wsp>
+                      <wps:cNvSpPr>
+                        <a:spLocks noChangeAspect="1" noChangeArrowheads="1"/>
+                      </wps:cNvSpPr>
+                      <wps:spPr bwMode="auto">
+                        <a:xfrm>
+                          <a:off x="0" y="0"/>
+                          <a:ext cx="304800" cy="304800"/>
+                        </a:xfrm>
+                        <a:prstGeom prst="rect">
+                          <a:avLst/>
+                        </a:prstGeom>
+                        <a:noFill/>
+                        <a:ln>
+                          <a:noFill/>
+                        </a:ln>
+                        <a:extLst>
+                          <a:ext uri="{909E8E84-426E-40DD-AFC4-6F175D3DCCD1}">
+                            <a14:hiddenFill xmlns:a14="http://schemas.microsoft.com/office/drawing/2010/main">
+                              <a:solidFill>
+                                <a:srgbClr val="FFFFFF"/>
+                              </a:solidFill>
+                            </a14:hiddenFill>
+                          </a:ext>
+                          <a:ext uri="{91240B29-F687-4F45-9708-019B960494DF}">
+                            <a14:hiddenLine xmlns:a14="http://schemas.microsoft.com/office/drawing/2010/main" w="9525">
+                              <a:solidFill>
+                                <a:srgbClr val="000000"/>
+                              </a:solidFill>
+                              <a:miter lim="800000"/>
+                              <a:headEnd/>
+                              <a:tailEnd/>
+                            </a14:hiddenLine>
+                          </a:ext>
+                        </a:extLst>
+                      </wps:spPr>
+                      <wps:bodyPr rot="0" vert="horz" wrap="square" lIns="91440" tIns="45720" rIns="91440" bIns="45720" anchor="t" anchorCtr="0" upright="1">
+                        <a:noAutofit/>
+                      </wps:bodyPr>
+                    </wps:wsp>
+                  </a:graphicData>
+                </a:graphic>
+              </wp:inline>
+            </w:drawing>
+          </mc:Choice>
+          <mc:Fallback>
+            <w:pict>
+              <v:rect w14:anchorId="5AF61F65" id="Rectangle 5" o:spid="_x0000_s1026" alt="Carbon Cycle" style="width:24pt;height:24pt;visibility:visible;mso-wrap-style:square;mso-left-percent:-10001;mso-top-percent:-10001;mso-position-horizontal:absolute;mso-position-horizontal-relative:char;mso-position-vertical:absolute;mso-position-vertical-relative:line;mso-left-percent:-10001;mso-top-percent:-10001;v-text-anchor:top" o:gfxdata="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" filled="f" stroked="f">
+                <o:lock v:ext="edit" aspectratio="t"/>
+                <w10:anchorlock/>
+              </v:rect>
+            </w:pict>
+          </mc:Fallback>
+        </mc:AlternateContent>
+      </w:r>
+      <w:r>
+        <w:rPr>
+          <w:noProof/>
+          <w14:ligatures w14:val="standardContextual"/>
+        </w:rPr>
+        <w:t xml:space="preserve"> </w:t>
+      </w:r>
+      <w:r>
+        <w:rPr>
+          <w:rFonts w:ascii="Arial" w:hAnsi="Arial" w:cs="Arial"/>
+        </w:rPr>
+        <w:drawing>
+          <wp:inline distT="0" distB="0" distL="0" distR="0" wp14:anchorId="5ABCE83C" wp14:editId="2AB648D7">
+            <wp:extent cx="4274820" cy="2376261"/>
+            <wp:effectExtent l="0" t="0" r="0" b="5080"/>
+            <wp:docPr id="1159557008" name="Picture 1"/>
+            <wp:cNvGraphicFramePr>
+              <a:graphicFrameLocks xmlns:a="http://schemas.openxmlformats.org/drawingml/2006/main" noChangeAspect="1"/>
+            </wp:cNvGraphicFramePr>
+            <a:graphic xmlns:a="http://schemas.openxmlformats.org/drawingml/2006/main">
+              <a:graphicData uri="http://schemas.openxmlformats.org/drawingml/2006/picture">
+                <pic:pic xmlns:pic="http://schemas.openxmlformats.org/drawingml/2006/picture">
+                  <pic:nvPicPr>
+                    <pic:cNvPr id="1159557008" name=""/>
+                    <pic:cNvPicPr/>
+                  </pic:nvPicPr>
+                  <pic:blipFill>
+                    <a:blip r:embed="rId8"/>
+                    <a:stretch>
+                      <a:fillRect/>
+                    </a:stretch>
+                  </pic:blipFill>
+                  <pic:spPr>
+                    <a:xfrm>
+                      <a:off x="0" y="0"/>
+                      <a:ext cx="4286611" cy="2382815"/>
+                    </a:xfrm>
+                    <a:prstGeom prst="rect">
+                      <a:avLst/>
+                    </a:prstGeom>
+                  </pic:spPr>
+                </pic:pic>
+              </a:graphicData>
+            </a:graphic>
+          </wp:inline>
+        </w:drawing>
+      </w:r>
+    </w:p>
+    <w:p>
+      <w:pPr>
+        <w:pStyle w:val="NormalWeb"/>
+        <w:jc w:val="center"/>
+        <w:rPr>
+          <w:rFonts w:ascii="Arial" w:hAnsi="Arial" w:cs="Arial"/>
+        </w:rPr>
+      </w:pPr>
+      <w:r>
+        <w:rPr>
+          <w:rFonts w:ascii="Arial" w:hAnsi="Arial" w:cs="Arial"/>
+        </w:rPr>
+        <w:t>Figure 1. Carbon cycle</w:t>
+      </w:r>
+      <w:r>
+        <w:rPr>
+          <w:rFonts w:ascii="Arial" w:hAnsi="Arial" w:cs="Arial"/>
+        </w:rPr>
+        <w:t xml:space="preserve"> </w:t>
+      </w:r>
+      <w:sdt>
+        <w:sdtPr>
+          <w:rPr>
+            <w:rFonts w:ascii="Arial" w:hAnsi="Arial" w:cs="Arial"/>
+          </w:rPr>
+          <w:id w:val="-469599160"/>
+          <w:citation/>
+        </w:sdtPr>
+        <w:sdtContent>
+          <w:r>
+            <w:rPr>
+              <w:rFonts w:ascii="Arial" w:hAnsi="Arial" w:cs="Arial"/>
+            </w:rPr>
+            <w:fldChar w:fldCharType="begin"/>
+          </w:r>
+          <w:r>
+            <w:rPr>
+              <w:rFonts w:ascii="Arial" w:hAnsi="Arial" w:cs="Arial"/>
+              <w:lang w:val="en-US"/>
+            </w:rPr>
+            <w:instrText xml:space="preserve"> CITATION Hab24 \l 1033 </w:instrText>
+          </w:r>
+          <w:r>
+            <w:rPr>
+              <w:rFonts w:ascii="Arial" w:hAnsi="Arial" w:cs="Arial"/>
+            </w:rPr>
+            <w:fldChar w:fldCharType="separate"/>
+          </w:r>
+          <w:r>
+            <w:rPr>
+              <w:rFonts w:ascii="Arial" w:hAnsi="Arial" w:cs="Arial"/>
+              <w:noProof/>
+              <w:lang w:val="en-US"/>
+            </w:rPr>
+            <w:t>(Habeeb Fadya A., 2024)</w:t>
+          </w:r>
+          <w:r>
+            <w:rPr>
+              <w:rFonts w:ascii="Arial" w:hAnsi="Arial" w:cs="Arial"/>
+            </w:rPr>
+            <w:fldChar w:fldCharType="end"/>
+          </w:r>
+        </w:sdtContent>
+      </w:sdt>
+      <w:r>
+        <w:rPr>
+          <w:rFonts w:ascii="Arial" w:hAnsi="Arial" w:cs="Arial"/>
+        </w:rPr>
+        <w:t xml:space="preserve">. </w:t>
       </w:r>
     </w:p>
     <w:p>
@@ -2398,6 +2689,70 @@
         </w:rPr>
         <w:t>For example, through photosynthesis, plants absorb carbon dioxide from the air and use this carbon to form their leaves, stems, and roots. This means that plants store carbon. When animals feed on plants, they use this carbon as a source of energy and to build their own bodies.</w:t>
       </w:r>
+      <w:r>
+        <w:rPr>
+          <w:rFonts w:ascii="Arial" w:hAnsi="Arial" w:cs="Arial"/>
+        </w:rPr>
+        <w:t xml:space="preserve"> </w:t>
+      </w:r>
+      <w:r>
+        <w:rPr>
+          <w:rFonts w:ascii="Arial" w:hAnsi="Arial" w:cs="Arial"/>
+        </w:rPr>
+        <w:t>The ocean also absorbs carbon dioxide and is considered the reservoir with the greatest capacity for carbon absorption near the Earth's surface, but most of that reservoir does not participate in rapid exchange with the atmosphere</w:t>
+      </w:r>
+      <w:sdt>
+        <w:sdtPr>
+          <w:rPr>
+            <w:rFonts w:ascii="Arial" w:hAnsi="Arial" w:cs="Arial"/>
+            <w:lang w:val="pt-BR"/>
+          </w:rPr>
+          <w:id w:val="1673981660"/>
+          <w:citation/>
+        </w:sdtPr>
+        <w:sdtContent>
+          <w:r>
+            <w:rPr>
+              <w:rFonts w:ascii="Arial" w:hAnsi="Arial" w:cs="Arial"/>
+              <w:lang w:val="pt-BR"/>
+            </w:rPr>
+            <w:fldChar w:fldCharType="begin"/>
+          </w:r>
+          <w:r>
+            <w:rPr>
+              <w:rFonts w:ascii="Arial" w:hAnsi="Arial" w:cs="Arial"/>
+            </w:rPr>
+            <w:instrText xml:space="preserve"> CITATION Env13 \l 1033 </w:instrText>
+          </w:r>
+          <w:r>
+            <w:rPr>
+              <w:rFonts w:ascii="Arial" w:hAnsi="Arial" w:cs="Arial"/>
+              <w:lang w:val="pt-BR"/>
+            </w:rPr>
+            <w:fldChar w:fldCharType="separate"/>
+          </w:r>
+          <w:r>
+            <w:rPr>
+              <w:rFonts w:ascii="Arial" w:hAnsi="Arial" w:cs="Arial"/>
+              <w:noProof/>
+            </w:rPr>
+            <w:t xml:space="preserve"> (Environmental Protection Agency (EPA), 2013)</w:t>
+          </w:r>
+          <w:r>
+            <w:rPr>
+              <w:rFonts w:ascii="Arial" w:hAnsi="Arial" w:cs="Arial"/>
+              <w:lang w:val="pt-BR"/>
+            </w:rPr>
+            <w:fldChar w:fldCharType="end"/>
+          </w:r>
+        </w:sdtContent>
+      </w:sdt>
+      <w:r>
+        <w:rPr>
+          <w:rFonts w:ascii="Arial" w:hAnsi="Arial" w:cs="Arial"/>
+        </w:rPr>
+        <w:t>.</w:t>
+      </w:r>
     </w:p>
     <w:p>
       <w:pPr>
@@ -2411,6 +2766,7 @@
         <w:rPr>
           <w:rFonts w:ascii="Arial" w:hAnsi="Arial" w:cs="Arial"/>
         </w:rPr>
+        <w:lastRenderedPageBreak/>
         <w:t>In swamps and on the ocean floor, dead plants and animals do not decompose completely and end up buried in layers of sediment. Over millions of years, heat and pressure transform the carbon from these plants and animals into fossil fuels such as coal, oil, and natural gas</w:t>
       </w:r>
       <w:sdt>
@@ -2484,7 +2840,340 @@
         <w:rPr>
           <w:rFonts w:ascii="Arial" w:hAnsi="Arial" w:cs="Arial"/>
         </w:rPr>
-        <w:t>The ocean also absorbs carbon dioxide and is considered the reservoir with the greatest capacity for carbon absorption near the Earth's surface, but most of that reservoir does not participate in rapid exchange with the atmosphere</w:t>
+        <w:t>However, human activities</w:t>
+      </w:r>
+      <w:r>
+        <w:rPr>
+          <w:rFonts w:ascii="Arial" w:hAnsi="Arial" w:cs="Arial"/>
+        </w:rPr>
+        <w:t xml:space="preserve">, </w:t>
+      </w:r>
+      <w:r>
+        <w:rPr>
+          <w:rFonts w:ascii="Arial" w:hAnsi="Arial" w:cs="Arial"/>
+        </w:rPr>
+        <w:t>particularly those related to the combustion of fossil fuels and certain industrial processes</w:t>
+      </w:r>
+      <w:r>
+        <w:rPr>
+          <w:rFonts w:ascii="Arial" w:hAnsi="Arial" w:cs="Arial"/>
+        </w:rPr>
+        <w:t xml:space="preserve">, </w:t>
+      </w:r>
+      <w:r>
+        <w:rPr>
+          <w:rFonts w:ascii="Arial" w:hAnsi="Arial" w:cs="Arial"/>
+        </w:rPr>
+        <w:t>have disrupted this balance by increasing the concentration of greenhouse gases, such as CO</w:t>
+      </w:r>
+      <w:r>
+        <w:rPr>
+          <w:rFonts w:ascii="Cambria Math" w:hAnsi="Cambria Math" w:cs="Cambria Math"/>
+        </w:rPr>
+        <w:t>₂</w:t>
+      </w:r>
+      <w:r>
+        <w:rPr>
+          <w:rFonts w:ascii="Arial" w:hAnsi="Arial" w:cs="Arial"/>
+        </w:rPr>
+        <w:t>, water vapor (H</w:t>
+      </w:r>
+      <w:r>
+        <w:rPr>
+          <w:rFonts w:ascii="Cambria Math" w:hAnsi="Cambria Math" w:cs="Cambria Math"/>
+        </w:rPr>
+        <w:t>₂</w:t>
+      </w:r>
+      <w:r>
+        <w:rPr>
+          <w:rFonts w:ascii="Arial" w:hAnsi="Arial" w:cs="Arial"/>
+        </w:rPr>
+        <w:t>O), methane (CH</w:t>
+      </w:r>
+      <w:r>
+        <w:rPr>
+          <w:rFonts w:ascii="Cambria Math" w:hAnsi="Cambria Math" w:cs="Cambria Math"/>
+        </w:rPr>
+        <w:t>₄</w:t>
+      </w:r>
+      <w:r>
+        <w:rPr>
+          <w:rFonts w:ascii="Arial" w:hAnsi="Arial" w:cs="Arial"/>
+        </w:rPr>
+        <w:t>), nitrous oxide (N</w:t>
+      </w:r>
+      <w:r>
+        <w:rPr>
+          <w:rFonts w:ascii="Cambria Math" w:hAnsi="Cambria Math" w:cs="Cambria Math"/>
+        </w:rPr>
+        <w:t>₂</w:t>
+      </w:r>
+      <w:r>
+        <w:rPr>
+          <w:rFonts w:ascii="Arial" w:hAnsi="Arial" w:cs="Arial"/>
+        </w:rPr>
+        <w:t>O), ozone (O</w:t>
+      </w:r>
+      <w:r>
+        <w:rPr>
+          <w:rFonts w:ascii="Cambria Math" w:hAnsi="Cambria Math" w:cs="Cambria Math"/>
+        </w:rPr>
+        <w:t>₃</w:t>
+      </w:r>
+      <w:r>
+        <w:rPr>
+          <w:rFonts w:ascii="Arial" w:hAnsi="Arial" w:cs="Arial"/>
+        </w:rPr>
+        <w:t>), and fluorinated gases such as CFCs.</w:t>
+      </w:r>
+    </w:p>
+    <w:p>
+      <w:pPr>
+        <w:pStyle w:val="NormalWeb"/>
+        <w:jc w:val="both"/>
+        <w:rPr>
+          <w:rFonts w:ascii="Arial" w:hAnsi="Arial" w:cs="Arial"/>
+        </w:rPr>
+      </w:pPr>
+      <w:r>
+        <w:rPr>
+          <w:rFonts w:ascii="Arial" w:hAnsi="Arial" w:cs="Arial"/>
+        </w:rPr>
+        <w:t>Greenhouse gases reduce the amount of infrared radiation that escapes directly into space by absorbing and re-emitting part of this energy within the atmosphere. The resulting increase in heat retained within the climate system contributes to global warming.</w:t>
+      </w:r>
+    </w:p>
+    <w:p>
+      <w:pPr>
+        <w:pStyle w:val="NormalWeb"/>
+        <w:jc w:val="both"/>
+        <w:rPr>
+          <w:rFonts w:ascii="Arial" w:hAnsi="Arial" w:cs="Arial"/>
+          <w:lang w:val="pt-BR"/>
+        </w:rPr>
+      </w:pPr>
+      <w:r>
+        <w:rPr>
+          <w:rFonts w:ascii="Arial" w:hAnsi="Arial" w:cs="Arial"/>
+          <w:lang w:val="pt-BR"/>
+        </w:rPr>
+        <w:t>Porque es importante este tema para las empresas:</w:t>
+      </w:r>
+    </w:p>
+    <w:p>
+      <w:pPr>
+        <w:pStyle w:val="NormalWeb"/>
+        <w:rPr>
+          <w:rFonts w:ascii="Arial" w:hAnsi="Arial" w:cs="Arial"/>
+          <w:lang w:val="pt-BR"/>
+        </w:rPr>
+      </w:pPr>
+    </w:p>
+    <w:p>
+      <w:pPr>
+        <w:pStyle w:val="NormalWeb"/>
+        <w:jc w:val="both"/>
+        <w:rPr>
+          <w:rFonts w:ascii="Arial" w:hAnsi="Arial" w:cs="Arial"/>
+          <w:lang w:val="pt-BR"/>
+        </w:rPr>
+      </w:pPr>
+      <w:r>
+        <w:rPr>
+          <w:rFonts w:ascii="Arial" w:hAnsi="Arial" w:cs="Arial"/>
+        </w:rPr>
+        <w:t xml:space="preserve">Large corporations have a vital role to play in efforts to mitigate global warming as the dominant producers of industrial greenhouse gas (GHG) emissions </w:t>
+      </w:r>
+      <w:sdt>
+        <w:sdtPr>
+          <w:rPr>
+            <w:rFonts w:ascii="Arial" w:hAnsi="Arial" w:cs="Arial"/>
+          </w:rPr>
+          <w:id w:val="-530340488"/>
+          <w:citation/>
+        </w:sdtPr>
+        <w:sdtContent>
+          <w:r>
+            <w:rPr>
+              <w:rFonts w:ascii="Arial" w:hAnsi="Arial" w:cs="Arial"/>
+            </w:rPr>
+            <w:fldChar w:fldCharType="begin"/>
+          </w:r>
+          <w:r>
+            <w:rPr>
+              <w:rFonts w:ascii="Arial" w:hAnsi="Arial" w:cs="Arial"/>
+            </w:rPr>
+            <w:instrText xml:space="preserve">CITATION Dow11 \l 1033 </w:instrText>
+          </w:r>
+          <w:r>
+            <w:rPr>
+              <w:rFonts w:ascii="Arial" w:hAnsi="Arial" w:cs="Arial"/>
+            </w:rPr>
+            <w:fldChar w:fldCharType="separate"/>
+          </w:r>
+          <w:r>
+            <w:rPr>
+              <w:rFonts w:ascii="Arial" w:hAnsi="Arial" w:cs="Arial"/>
+              <w:noProof/>
+            </w:rPr>
+            <w:t>(John Downie, 2011)</w:t>
+          </w:r>
+          <w:r>
+            <w:rPr>
+              <w:rFonts w:ascii="Arial" w:hAnsi="Arial" w:cs="Arial"/>
+            </w:rPr>
+            <w:fldChar w:fldCharType="end"/>
+          </w:r>
+        </w:sdtContent>
+      </w:sdt>
+      <w:r>
+        <w:rPr>
+          <w:rFonts w:ascii="Arial" w:hAnsi="Arial" w:cs="Arial"/>
+        </w:rPr>
+        <w:t xml:space="preserve">. </w:t>
+      </w:r>
+      <w:r>
+        <w:rPr>
+          <w:rFonts w:ascii="Arial" w:hAnsi="Arial" w:cs="Arial"/>
+          <w:lang w:val="pt-BR"/>
+        </w:rPr>
+        <w:t>E</w:t>
+      </w:r>
+      <w:r>
+        <w:rPr>
+          <w:rFonts w:ascii="Arial" w:hAnsi="Arial" w:cs="Arial"/>
+          <w:lang w:val="pt-BR"/>
+        </w:rPr>
+        <w:t>stas emisiones pueden cuantificarse mediante inventarios de gases de efecto invernadero</w:t>
+      </w:r>
+      <w:r>
+        <w:rPr>
+          <w:rFonts w:ascii="Arial" w:hAnsi="Arial" w:cs="Arial"/>
+          <w:lang w:val="pt-BR"/>
+        </w:rPr>
+        <w:t>, en ellos pueden consiferarse para su inventario</w:t>
+      </w:r>
+      <w:r>
+        <w:rPr>
+          <w:rFonts w:ascii="Arial" w:hAnsi="Arial" w:cs="Arial"/>
+          <w:lang w:val="pt-BR"/>
+        </w:rPr>
+        <w:t xml:space="preserve"> el scope 1, scope 2 and scope 3</w:t>
+      </w:r>
+      <w:r>
+        <w:rPr>
+          <w:rFonts w:ascii="Arial" w:hAnsi="Arial" w:cs="Arial"/>
+          <w:lang w:val="pt-BR"/>
+        </w:rPr>
+        <w:t xml:space="preserve"> (los cuales se describen a continuacion en la sifuiente Figura 2) </w:t>
+      </w:r>
+      <w:r>
+        <w:rPr>
+          <w:rFonts w:ascii="Arial" w:hAnsi="Arial" w:cs="Arial"/>
+          <w:lang w:val="pt-BR"/>
+        </w:rPr>
+        <w:t>y expresarse como toneladas de CO</w:t>
+      </w:r>
+      <w:r>
+        <w:rPr>
+          <w:rFonts w:ascii="Cambria Math" w:hAnsi="Cambria Math" w:cs="Cambria Math"/>
+          <w:lang w:val="pt-BR"/>
+        </w:rPr>
+        <w:t>₂</w:t>
+      </w:r>
+      <w:r>
+        <w:rPr>
+          <w:rFonts w:ascii="Arial" w:hAnsi="Arial" w:cs="Arial"/>
+          <w:lang w:val="pt-BR"/>
+        </w:rPr>
+        <w:t xml:space="preserve"> equivalente (tCO</w:t>
+      </w:r>
+      <w:r>
+        <w:rPr>
+          <w:rFonts w:ascii="Cambria Math" w:hAnsi="Cambria Math" w:cs="Cambria Math"/>
+          <w:lang w:val="pt-BR"/>
+        </w:rPr>
+        <w:t>₂</w:t>
+      </w:r>
+      <w:r>
+        <w:rPr>
+          <w:rFonts w:ascii="Arial" w:hAnsi="Arial" w:cs="Arial"/>
+          <w:lang w:val="pt-BR"/>
+        </w:rPr>
+        <w:t xml:space="preserve">e). </w:t>
+      </w:r>
+    </w:p>
+    <w:p>
+      <w:pPr>
+        <w:pStyle w:val="NormalWeb"/>
+        <w:rPr>
+          <w:rFonts w:ascii="Arial" w:hAnsi="Arial" w:cs="Arial"/>
+          <w:lang w:val="pt-BR"/>
+        </w:rPr>
+      </w:pPr>
+      <w:r>
+        <w:rPr>
+          <w:rFonts w:ascii="Arial" w:hAnsi="Arial" w:cs="Arial"/>
+          <w:lang w:val="pt-BR"/>
+        </w:rPr>
+        <w:drawing>
+          <wp:inline distT="0" distB="0" distL="0" distR="0" wp14:anchorId="3267687A" wp14:editId="441FE344">
+            <wp:extent cx="5494496" cy="2331922"/>
+            <wp:effectExtent l="0" t="0" r="0" b="0"/>
+            <wp:docPr id="1784026794" name="Picture 1"/>
+            <wp:cNvGraphicFramePr>
+              <a:graphicFrameLocks xmlns:a="http://schemas.openxmlformats.org/drawingml/2006/main" noChangeAspect="1"/>
+            </wp:cNvGraphicFramePr>
+            <a:graphic xmlns:a="http://schemas.openxmlformats.org/drawingml/2006/main">
+              <a:graphicData uri="http://schemas.openxmlformats.org/drawingml/2006/picture">
+                <pic:pic xmlns:pic="http://schemas.openxmlformats.org/drawingml/2006/picture">
+                  <pic:nvPicPr>
+                    <pic:cNvPr id="1784026794" name=""/>
+                    <pic:cNvPicPr/>
+                  </pic:nvPicPr>
+                  <pic:blipFill>
+                    <a:blip r:embed="rId9"/>
+                    <a:stretch>
+                      <a:fillRect/>
+                    </a:stretch>
+                  </pic:blipFill>
+                  <pic:spPr>
+                    <a:xfrm>
+                      <a:off x="0" y="0"/>
+                      <a:ext cx="5494496" cy="2331922"/>
+                    </a:xfrm>
+                    <a:prstGeom prst="rect">
+                      <a:avLst/>
+                    </a:prstGeom>
+                  </pic:spPr>
+                </pic:pic>
+              </a:graphicData>
+            </a:graphic>
+          </wp:inline>
+        </w:drawing>
+      </w:r>
+    </w:p>
+    <w:p>
+      <w:pPr>
+        <w:pStyle w:val="NormalWeb"/>
+        <w:jc w:val="center"/>
+        <w:rPr>
+          <w:rFonts w:ascii="Arial" w:hAnsi="Arial" w:cs="Arial"/>
+          <w:lang w:val="pt-BR"/>
+        </w:rPr>
+      </w:pPr>
+      <w:r>
+        <w:rPr>
+          <w:rFonts w:ascii="Arial" w:hAnsi="Arial" w:cs="Arial"/>
+          <w:lang w:val="pt-BR"/>
+        </w:rPr>
+        <w:t>Figura 2. GHG emissiones</w:t>
+      </w:r>
+      <w:r>
+        <w:rPr>
+          <w:rFonts w:ascii="Arial" w:hAnsi="Arial" w:cs="Arial"/>
+          <w:lang w:val="pt-BR"/>
+        </w:rPr>
+        <w:t xml:space="preserve"> </w:t>
       </w:r>
       <w:sdt>
         <w:sdtPr>
@@ -2492,7 +3181,7 @@
             <w:rFonts w:ascii="Arial" w:hAnsi="Arial" w:cs="Arial"/>
             <w:lang w:val="pt-BR"/>
           </w:rPr>
-          <w:id w:val="1326943267"/>
+          <w:id w:val="-357120732"/>
           <w:citation/>
         </w:sdtPr>
         <w:sdtContent>
@@ -2506,8 +3195,9 @@
           <w:r>
             <w:rPr>
               <w:rFonts w:ascii="Arial" w:hAnsi="Arial" w:cs="Arial"/>
-            </w:rPr>
-            <w:instrText xml:space="preserve"> CITATION Env13 \l 1033 </w:instrText>
+              <w:lang w:val="en-US"/>
+            </w:rPr>
+            <w:instrText xml:space="preserve">CITATION HHo \l 1033 </w:instrText>
           </w:r>
           <w:r>
             <w:rPr>
@@ -2520,8 +3210,9 @@
             <w:rPr>
               <w:rFonts w:ascii="Arial" w:hAnsi="Arial" w:cs="Arial"/>
               <w:noProof/>
-            </w:rPr>
-            <w:t xml:space="preserve"> (Environmental Protection Agency (EPA), 2013)</w:t>
+              <w:lang w:val="en-US"/>
+            </w:rPr>
+            <w:t>(Timo, 2008)</w:t>
           </w:r>
           <w:r>
             <w:rPr>
@@ -2535,6 +3226,7 @@
       <w:r>
         <w:rPr>
           <w:rFonts w:ascii="Arial" w:hAnsi="Arial" w:cs="Arial"/>
+          <w:lang w:val="pt-BR"/>
         </w:rPr>
         <w:t>.</w:t>
       </w:r>
@@ -2542,117 +3234,56 @@
     <w:p>
       <w:pPr>
         <w:pStyle w:val="NormalWeb"/>
-        <w:jc w:val="both"/>
-        <w:rPr>
-          <w:rFonts w:ascii="Arial" w:hAnsi="Arial" w:cs="Arial"/>
-        </w:rPr>
-      </w:pPr>
-      <w:r>
-        <w:rPr>
-          <w:rFonts w:ascii="Arial" w:hAnsi="Arial" w:cs="Arial"/>
-        </w:rPr>
-        <w:t>However, human activities have disrupted the carbon cycle: both by adding more CO</w:t>
-      </w:r>
-      <w:r>
-        <w:rPr>
-          <w:rFonts w:ascii="Arial" w:hAnsi="Arial" w:cs="Arial"/>
-          <w:vertAlign w:val="subscript"/>
-        </w:rPr>
-        <w:t>2</w:t>
-      </w:r>
-      <w:r>
-        <w:rPr>
-          <w:rFonts w:ascii="Arial" w:hAnsi="Arial" w:cs="Arial"/>
-        </w:rPr>
-        <w:t xml:space="preserve"> to the atmosphere and by affecting the ability of natural sinks (such as forests) to remove CO</w:t>
-      </w:r>
-      <w:r>
-        <w:rPr>
-          <w:rFonts w:ascii="Arial" w:hAnsi="Arial" w:cs="Arial"/>
-          <w:vertAlign w:val="subscript"/>
-        </w:rPr>
-        <w:t>2</w:t>
-      </w:r>
-      <w:r>
-        <w:rPr>
-          <w:rFonts w:ascii="Arial" w:hAnsi="Arial" w:cs="Arial"/>
-        </w:rPr>
-        <w:t xml:space="preserve"> from the atmosphere, as well as by influencing the land’s capacity to store carbon</w:t>
-      </w:r>
-      <w:sdt>
-        <w:sdtPr>
-          <w:rPr>
-            <w:rFonts w:ascii="Arial" w:hAnsi="Arial" w:cs="Arial"/>
-          </w:rPr>
-          <w:id w:val="-719817485"/>
-          <w:citation/>
-        </w:sdtPr>
-        <w:sdtContent>
-          <w:r>
-            <w:rPr>
-              <w:rFonts w:ascii="Arial" w:hAnsi="Arial" w:cs="Arial"/>
-            </w:rPr>
-            <w:fldChar w:fldCharType="begin"/>
-          </w:r>
-          <w:r>
-            <w:rPr>
-              <w:rFonts w:ascii="Arial" w:hAnsi="Arial" w:cs="Arial"/>
-              <w:lang w:val="en-US"/>
-            </w:rPr>
-            <w:instrText xml:space="preserve"> CITATION Env26 \l 1033 </w:instrText>
-          </w:r>
-          <w:r>
-            <w:rPr>
-              <w:rFonts w:ascii="Arial" w:hAnsi="Arial" w:cs="Arial"/>
-            </w:rPr>
-            <w:fldChar w:fldCharType="separate"/>
-          </w:r>
-          <w:r>
-            <w:rPr>
-              <w:rFonts w:ascii="Arial" w:hAnsi="Arial" w:cs="Arial"/>
-              <w:noProof/>
-              <w:lang w:val="en-US"/>
-            </w:rPr>
-            <w:t xml:space="preserve"> </w:t>
-          </w:r>
-          <w:r>
-            <w:rPr>
-              <w:rFonts w:ascii="Arial" w:hAnsi="Arial" w:cs="Arial"/>
-              <w:noProof/>
-              <w:lang w:val="en-US"/>
-            </w:rPr>
-            <w:t>(EPA, 2026)</w:t>
-          </w:r>
-          <w:r>
-            <w:rPr>
-              <w:rFonts w:ascii="Arial" w:hAnsi="Arial" w:cs="Arial"/>
-            </w:rPr>
-            <w:fldChar w:fldCharType="end"/>
-          </w:r>
-        </w:sdtContent>
-      </w:sdt>
-      <w:r>
-        <w:rPr>
-          <w:rFonts w:ascii="Arial" w:hAnsi="Arial" w:cs="Arial"/>
-        </w:rPr>
-        <w:t xml:space="preserve">. </w:t>
+        <w:rPr>
+          <w:rFonts w:ascii="Arial" w:hAnsi="Arial" w:cs="Arial"/>
+          <w:lang w:val="pt-BR"/>
+        </w:rPr>
+      </w:pPr>
+      <w:r>
+        <w:rPr>
+          <w:rFonts w:ascii="Arial" w:hAnsi="Arial" w:cs="Arial"/>
+          <w:lang w:val="pt-BR"/>
+        </w:rPr>
+        <w:t>Esta información constituye una parte importante de los indicadores ambientales utilizados en el contexto ESG</w:t>
+      </w:r>
+      <w:r>
+        <w:rPr>
+          <w:rFonts w:ascii="Arial" w:hAnsi="Arial" w:cs="Arial"/>
+          <w:lang w:val="pt-BR"/>
+        </w:rPr>
+        <w:t xml:space="preserve"> (Environmental, Social and Governance criterial)</w:t>
+      </w:r>
+      <w:r>
+        <w:rPr>
+          <w:rFonts w:ascii="Arial" w:hAnsi="Arial" w:cs="Arial"/>
+          <w:lang w:val="pt-BR"/>
+        </w:rPr>
+        <w:t>.</w:t>
       </w:r>
     </w:p>
     <w:p>
       <w:pPr>
         <w:pStyle w:val="NormalWeb"/>
-        <w:jc w:val="both"/>
         <w:rPr>
           <w:rFonts w:ascii="Arial" w:hAnsi="Arial" w:cs="Arial"/>
           <w:lang w:val="pt-BR"/>
         </w:rPr>
       </w:pPr>
-      <w:r>
+    </w:p>
+    <w:p>
+      <w:pPr>
+        <w:pStyle w:val="NormalWeb"/>
         <w:rPr>
           <w:rFonts w:ascii="Arial" w:hAnsi="Arial" w:cs="Arial"/>
           <w:lang w:val="pt-BR"/>
         </w:rPr>
-        <w:t>Porque es importante este tema para las empresas:</w:t>
+      </w:pPr>
+      <w:r>
+        <w:rPr>
+          <w:rFonts w:ascii="Arial" w:hAnsi="Arial" w:cs="Arial"/>
+          <w:lang w:val="pt-BR"/>
+        </w:rPr>
+        <w:t>Que esta pasando actualmente</w:t>
       </w:r>
     </w:p>
     <w:p>
@@ -2668,8 +3299,38 @@
           <w:rFonts w:ascii="Arial" w:hAnsi="Arial" w:cs="Arial"/>
           <w:lang w:val="pt-BR"/>
         </w:rPr>
+        <w:t>Cual es la oportunidad o necesidad</w:t>
+      </w:r>
+    </w:p>
+    <w:p>
+      <w:pPr>
+        <w:pStyle w:val="NormalWeb"/>
+        <w:rPr>
+          <w:rFonts w:ascii="Arial" w:hAnsi="Arial" w:cs="Arial"/>
+          <w:lang w:val="pt-BR"/>
+        </w:rPr>
+      </w:pPr>
+      <w:r>
+        <w:rPr>
+          <w:rFonts w:ascii="Arial" w:hAnsi="Arial" w:cs="Arial"/>
+          <w:lang w:val="pt-BR"/>
+        </w:rPr>
         <w:lastRenderedPageBreak/>
-        <w:t>Que esta pasando actualmente</w:t>
+        <w:t>S</w:t>
+      </w:r>
+      <w:r>
+        <w:rPr>
+          <w:rFonts w:ascii="Arial" w:hAnsi="Arial" w:cs="Arial"/>
+          <w:lang w:val="pt-BR"/>
+        </w:rPr>
+        <w:t xml:space="preserve">in embargo, disponer de información histórica sobre emisiones no necesariamente permite a las organizaciones anticipar su evolución futura ni evaluar cómo diferentes decisiones operativas podrían modificar su trayectoria. Esto plantea una oportunidad para aplicar técnicas de análisis de datos y </w:t>
+      </w:r>
+      <w:r>
+        <w:rPr>
+          <w:rFonts w:ascii="Arial" w:hAnsi="Arial" w:cs="Arial"/>
+          <w:lang w:val="pt-BR"/>
+        </w:rPr>
+        <w:t xml:space="preserve">prediccion. </w:t>
       </w:r>
     </w:p>
     <w:p>
@@ -2685,7 +3346,7 @@
           <w:rFonts w:ascii="Arial" w:hAnsi="Arial" w:cs="Arial"/>
           <w:lang w:val="pt-BR"/>
         </w:rPr>
-        <w:t>Cual es la oportunidad o necesidad</w:t>
+        <w:t>Aunque las emisiones históricas de gases de efecto invernadero son un indicador importante del desempeño medioambiental de una organización, los informes históricos por sí solos no proporcionan necesariamente información suficiente para respaldar la toma de decisiones con visión de futuro. Las organizaciones también deben comprender cómo pueden evolucionar sus emisiones en diferentes condiciones empresariales y operativas.</w:t>
       </w:r>
     </w:p>
     <w:p>
@@ -2701,7 +3362,42 @@
           <w:rFonts w:ascii="Arial" w:hAnsi="Arial" w:cs="Arial"/>
           <w:lang w:val="pt-BR"/>
         </w:rPr>
-        <w:t>Que hara este proyecto</w:t>
+        <w:t xml:space="preserve">Los datos históricos empresariales y medioambientales pueden utilizarse para identificar patrones y relaciones entre las características corporativas y las emisiones de gases de efecto invernadero. </w:t>
+      </w:r>
+      <w:r>
+        <w:rPr>
+          <w:rFonts w:ascii="Arial" w:hAnsi="Arial" w:cs="Arial"/>
+          <w:lang w:val="pt-BR"/>
+        </w:rPr>
+        <w:t>Esto supone una oportunidad para el análisis de datos y la elaboración de modelos predictivos</w:t>
+      </w:r>
+      <w:r>
+        <w:rPr>
+          <w:rFonts w:ascii="Arial" w:hAnsi="Arial" w:cs="Arial"/>
+          <w:lang w:val="pt-BR"/>
+        </w:rPr>
+        <w:t xml:space="preserve"> </w:t>
+      </w:r>
+      <w:r>
+        <w:rPr>
+          <w:rFonts w:ascii="Arial" w:hAnsi="Arial" w:cs="Arial"/>
+          <w:lang w:val="pt-BR"/>
+        </w:rPr>
+        <w:t xml:space="preserve">para estimar las emisiones futuras, </w:t>
+      </w:r>
+      <w:r>
+        <w:rPr>
+          <w:rFonts w:ascii="Arial" w:hAnsi="Arial" w:cs="Arial"/>
+          <w:lang w:val="pt-BR"/>
+        </w:rPr>
+        <w:t>y a su vez</w:t>
+      </w:r>
+      <w:r>
+        <w:rPr>
+          <w:rFonts w:ascii="Arial" w:hAnsi="Arial" w:cs="Arial"/>
+          <w:lang w:val="pt-BR"/>
+        </w:rPr>
+        <w:t xml:space="preserve"> el análisis de escenarios puede servir para explorar cómo los cambios en las variables relevantes pueden afectar a la trayectoria de emisiones prevista.</w:t>
       </w:r>
     </w:p>
     <w:p>
@@ -2958,6 +3654,7 @@
           <w:bCs/>
           <w:color w:val="auto"/>
         </w:rPr>
+        <w:lastRenderedPageBreak/>
         <w:t>VII</w:t>
       </w:r>
       <w:r>
@@ -3048,7 +3745,6 @@
           <w:bCs/>
           <w:color w:val="auto"/>
         </w:rPr>
-        <w:lastRenderedPageBreak/>
         <w:t>IX</w:t>
       </w:r>
       <w:r>
@@ -3278,7 +3974,13 @@
     <w:sdt>
       <w:sdtPr>
         <w:rPr>
-          <w:lang w:val="en-GB"/>
+          <w:rFonts w:ascii="Calibri" w:eastAsia="Calibri" w:hAnsi="Calibri" w:cs="Calibri"/>
+          <w:color w:val="auto"/>
+          <w:kern w:val="0"/>
+          <w:sz w:val="22"/>
+          <w:szCs w:val="22"/>
+          <w:lang w:val="en-GB" w:eastAsia="en-IE"/>
+          <w14:ligatures w14:val="none"/>
         </w:rPr>
         <w:id w:val="-2132091116"/>
         <w:docPartObj>
@@ -3288,13 +3990,7 @@
       </w:sdtPr>
       <w:sdtEndPr>
         <w:rPr>
-          <w:rFonts w:ascii="Calibri" w:eastAsia="Calibri" w:hAnsi="Calibri" w:cs="Calibri"/>
-          <w:color w:val="auto"/>
-          <w:kern w:val="0"/>
-          <w:sz w:val="22"/>
-          <w:szCs w:val="22"/>
-          <w:lang w:val="en-IE" w:eastAsia="en-IE"/>
-          <w14:ligatures w14:val="none"/>
+          <w:lang w:val="en-IE"/>
         </w:rPr>
       </w:sdtEndPr>
       <w:sdtContent>
@@ -3388,9 +4084,83 @@
         <w:spacing w:after="0"/>
       </w:pPr>
     </w:p>
-    <w:p/>
+    <w:p>
+      <w:pPr>
+        <w:rPr>
+          <w:lang w:val="pt-BR"/>
+        </w:rPr>
+      </w:pPr>
+      <w:r>
+        <w:rPr>
+          <w:lang w:val="pt-BR"/>
+        </w:rPr>
+        <w:t>Glosario:</w:t>
+      </w:r>
+    </w:p>
+    <w:p>
+      <w:pPr>
+        <w:rPr>
+          <w:lang w:val="pt-BR"/>
+        </w:rPr>
+      </w:pPr>
+      <w:r>
+        <w:rPr>
+          <w:lang w:val="pt-BR"/>
+        </w:rPr>
+        <w:t>Gases de efecto invernadero:</w:t>
+      </w:r>
+    </w:p>
+    <w:p>
+      <w:r>
+        <w:lastRenderedPageBreak/>
+        <w:t>CO2:</w:t>
+      </w:r>
+    </w:p>
+    <w:p>
+      <w:r>
+        <w:t>t</w:t>
+      </w:r>
+      <w:r>
+        <w:t xml:space="preserve"> </w:t>
+      </w:r>
+      <w:r>
+        <w:t>CO2e:</w:t>
+      </w:r>
+    </w:p>
+    <w:p>
+      <w:r>
+        <w:t>Calentamiento Global:</w:t>
+      </w:r>
+    </w:p>
+    <w:p>
+      <w:pPr>
+        <w:rPr>
+          <w:rFonts w:ascii="Arial" w:hAnsi="Arial" w:cs="Arial"/>
+          <w:lang w:val="pt-BR"/>
+        </w:rPr>
+      </w:pPr>
+      <w:r>
+        <w:rPr>
+          <w:rFonts w:ascii="Arial" w:hAnsi="Arial" w:cs="Arial"/>
+          <w:lang w:val="pt-BR"/>
+        </w:rPr>
+        <w:t>inventarios de gases de efecto invernader</w:t>
+      </w:r>
+      <w:r>
+        <w:rPr>
+          <w:rFonts w:ascii="Arial" w:hAnsi="Arial" w:cs="Arial"/>
+          <w:lang w:val="pt-BR"/>
+        </w:rPr>
+        <w:t>:</w:t>
+      </w:r>
+    </w:p>
+    <w:p>
+      <w:r>
+        <w:t>ESG is a framework that helps stakeholders understand how an organization manages risks and opportunities around sustainability issues.</w:t>
+      </w:r>
+    </w:p>
     <w:sectPr>
-      <w:footerReference w:type="default" r:id="rId8"/>
+      <w:footerReference w:type="default" r:id="rId10"/>
       <w:pgSz w:w="11906" w:h="16838"/>
       <w:pgMar w:top="1440" w:right="1440" w:bottom="1440" w:left="1440" w:header="708" w:footer="708" w:gutter="0"/>
       <w:pgNumType w:start="1"/>
@@ -5007,7 +5777,7 @@
     <b:Month>September</b:Month>
     <b:Day>9</b:Day>
     <b:URL>https://sor.epa.gov/sor_internet/registry/termreg/searchandretrieve/glossariesandkeywordlists/search.do?details=&amp;vocabName=Glossary%20Climate%20Change%20Terms&amp;filterTerm=carbon%20cycle&amp;checkedAcronym=false&amp;checkedTerm=false&amp;hasDefinitions=false&amp;filterTerm</b:URL>
-    <b:RefOrder>2</b:RefOrder>
+    <b:RefOrder>3</b:RefOrder>
   </b:Source>
   <b:Source>
     <b:Tag>Env</b:Tag>
@@ -5023,13 +5793,80 @@
     <b:Year>2012</b:Year>
     <b:Month>September</b:Month>
     <b:Day>14</b:Day>
-    <b:RefOrder>3</b:RefOrder>
+    <b:RefOrder>4</b:RefOrder>
+  </b:Source>
+  <b:Source>
+    <b:Tag>Dow11</b:Tag>
+    <b:SourceType>DocumentFromInternetSite</b:SourceType>
+    <b:Guid>{6A8F3110-66EC-4FC7-B21D-2985AC613042}</b:Guid>
+    <b:Title>Evaluation of Australian companies’ scope 3 greenhouse gas</b:Title>
+    <b:Year>2011</b:Year>
+    <b:Month>September</b:Month>
+    <b:Day>24</b:Day>
+    <b:Author>
+      <b:Author>
+        <b:NameList>
+          <b:Person>
+            <b:Last>John Downie</b:Last>
+            <b:First>Wendy</b:First>
+            <b:Middle>Stubbs</b:Middle>
+          </b:Person>
+        </b:NameList>
+      </b:Author>
+    </b:Author>
+    <b:InternetSiteTitle>ELSEVIER</b:InternetSiteTitle>
+    <b:URL>https://www.sciencedirect.com/science/article/abs/pii/S0959652611003416</b:URL>
+    <b:RefOrder>5</b:RefOrder>
+  </b:Source>
+  <b:Source>
+    <b:Tag>Hab24</b:Tag>
+    <b:SourceType>DocumentFromInternetSite</b:SourceType>
+    <b:Guid>{7A64FE6C-F45C-4895-989D-C2F3BB58320C}</b:Guid>
+    <b:Author>
+      <b:Author>
+        <b:NameList>
+          <b:Person>
+            <b:Last>Habeeb Fadya A.</b:Last>
+            <b:First>Abdulfattah</b:First>
+            <b:Middle>Habeeb Mustafa, Layth Khaleel Yahya and N. Ameen Fatimah</b:Middle>
+          </b:Person>
+        </b:NameList>
+      </b:Author>
+    </b:Author>
+    <b:Title>Global Analysis and Prediction of CO2 and Greenhouse Gas Emissions across Continents </b:Title>
+    <b:InternetSiteTitle>ARTICLEINFO</b:InternetSiteTitle>
+    <b:Year>2024</b:Year>
+    <b:Month>November</b:Month>
+    <b:Day>25</b:Day>
+    <b:URL>https://www.bing.com/ck/a?!&amp;&amp;p=3a2c4c3c80f3c636645997da40ee3de7babee04b043e6f7224ecd54831762cc0JmltdHM9MTc5MDg5OTIwMA&amp;ptn=3&amp;ver=2&amp;hsh=4&amp;fclid=08ab4975-cd86-6830-1003-5e52ccfd69e7&amp;psq=Global+Analysis+and+Prediction+of+CO2+and+Greenhouse+Gas+Emissions+acros</b:URL>
+    <b:RefOrder>2</b:RefOrder>
+  </b:Source>
+  <b:Source>
+    <b:Tag>HHo</b:Tag>
+    <b:SourceType>JournalArticle</b:SourceType>
+    <b:Guid>{C9448315-E4D0-449B-8DA7-B87E124C84C0}</b:Guid>
+    <b:Title>Corporate Carbon Performance Indicators: Carbon Intensity, Dependency, Exposure and Risk</b:Title>
+    <b:Author>
+      <b:Author>
+        <b:NameList>
+          <b:Person>
+            <b:Last>Timo</b:Last>
+            <b:First>H.</b:First>
+            <b:Middle>Hoffmann Volker and Busch</b:Middle>
+          </b:Person>
+        </b:NameList>
+      </b:Author>
+    </b:Author>
+    <b:JournalName>Journal of Industrial Ecology</b:JournalName>
+    <b:Pages>505-520</b:Pages>
+    <b:Year>2008</b:Year>
+    <b:RefOrder>6</b:RefOrder>
   </b:Source>
 </b:Sources>
 </file>
 
 <file path=customXml/itemProps1.xml><?xml version="1.0" encoding="utf-8"?>
-<ds:datastoreItem xmlns:ds="http://schemas.openxmlformats.org/officeDocument/2006/customXml" ds:itemID="{350E676F-BDCF-4D5A-891A-FA8FD588DC52}">
+<ds:datastoreItem xmlns:ds="http://schemas.openxmlformats.org/officeDocument/2006/customXml" ds:itemID="{67E9B32A-44BA-449E-907A-A8995C2F4140}">
   <ds:schemaRefs>
     <ds:schemaRef ds:uri="http://schemas.openxmlformats.org/officeDocument/2006/bibliography"/>
   </ds:schemaRefs>

</xml_diff>

<commit_message>
Addition of scope, aim, and objectives
</commit_message>
<xml_diff>
--- a/CA1-ANDREA DIAZ MEDRANO.docx
+++ b/CA1-ANDREA DIAZ MEDRANO.docx
@@ -36,7 +36,7 @@
                     <pic:cNvPicPr preferRelativeResize="0"/>
                   </pic:nvPicPr>
                   <pic:blipFill>
-                    <a:blip r:embed="rId7"/>
+                    <a:blip r:embed="rId8"/>
                     <a:srcRect/>
                     <a:stretch>
                       <a:fillRect/>
@@ -2475,7 +2475,7 @@
                     <pic:cNvPicPr/>
                   </pic:nvPicPr>
                   <pic:blipFill>
-                    <a:blip r:embed="rId8"/>
+                    <a:blip r:embed="rId9"/>
                     <a:stretch>
                       <a:fillRect/>
                     </a:stretch>
@@ -2616,7 +2616,14 @@
               <w:rFonts w:ascii="Arial" w:hAnsi="Arial" w:cs="Arial"/>
               <w:noProof/>
             </w:rPr>
-            <w:t xml:space="preserve"> (Environmental Protection Agency (EPA), 2013)</w:t>
+            <w:t xml:space="preserve"> </w:t>
+          </w:r>
+          <w:r>
+            <w:rPr>
+              <w:rFonts w:ascii="Arial" w:hAnsi="Arial" w:cs="Arial"/>
+              <w:noProof/>
+            </w:rPr>
+            <w:t>(Environmental Protection Agency (EPA), 2013)</w:t>
           </w:r>
           <w:r>
             <w:rPr>
@@ -2765,7 +2772,14 @@
               <w:rFonts w:ascii="Arial" w:hAnsi="Arial" w:cs="Arial"/>
               <w:noProof/>
             </w:rPr>
-            <w:t xml:space="preserve"> (Environmental Protection Agency (EPA), 2013)</w:t>
+            <w:t xml:space="preserve"> </w:t>
+          </w:r>
+          <w:r>
+            <w:rPr>
+              <w:rFonts w:ascii="Arial" w:hAnsi="Arial" w:cs="Arial"/>
+              <w:noProof/>
+            </w:rPr>
+            <w:t>(Environmental Protection Agency (EPA), 2013)</w:t>
           </w:r>
           <w:r>
             <w:rPr>
@@ -2969,23 +2983,6 @@
           <w:rFonts w:ascii="Arial" w:hAnsi="Arial" w:cs="Arial"/>
         </w:rPr>
         <w:t>Greenhouse gases reduce the amount of infrared radiation that escapes directly into space by absorbing and re-emitting part of this energy within the atmosphere. The resulting increase in heat retained within the climate system contributes to global warming.</w:t>
-      </w:r>
-    </w:p>
-    <w:p>
-      <w:pPr>
-        <w:pStyle w:val="NormalWeb"/>
-        <w:jc w:val="both"/>
-        <w:rPr>
-          <w:rFonts w:ascii="Arial" w:hAnsi="Arial" w:cs="Arial"/>
-          <w:lang w:val="pt-BR"/>
-        </w:rPr>
-      </w:pPr>
-      <w:r>
-        <w:rPr>
-          <w:rFonts w:ascii="Arial" w:hAnsi="Arial" w:cs="Arial"/>
-          <w:lang w:val="pt-BR"/>
-        </w:rPr>
-        <w:t>Porque es importante este tema para las empresas:</w:t>
       </w:r>
     </w:p>
     <w:p>
@@ -3144,7 +3141,7 @@
                     <pic:cNvPicPr/>
                   </pic:nvPicPr>
                   <pic:blipFill>
-                    <a:blip r:embed="rId9"/>
+                    <a:blip r:embed="rId10"/>
                     <a:stretch>
                       <a:fillRect/>
                     </a:stretch>
@@ -3171,20 +3168,33 @@
         <w:jc w:val="center"/>
         <w:rPr>
           <w:rFonts w:ascii="Arial" w:hAnsi="Arial" w:cs="Arial"/>
-          <w:lang w:val="pt-BR"/>
-        </w:rPr>
-      </w:pPr>
-      <w:r>
-        <w:rPr>
-          <w:rFonts w:ascii="Arial" w:hAnsi="Arial" w:cs="Arial"/>
-          <w:lang w:val="pt-BR"/>
-        </w:rPr>
-        <w:t>Figura 2. GHG emissiones</w:t>
-      </w:r>
-      <w:r>
-        <w:rPr>
-          <w:rFonts w:ascii="Arial" w:hAnsi="Arial" w:cs="Arial"/>
-          <w:lang w:val="pt-BR"/>
+        </w:rPr>
+      </w:pPr>
+      <w:proofErr w:type="spellStart"/>
+      <w:r>
+        <w:rPr>
+          <w:rFonts w:ascii="Arial" w:hAnsi="Arial" w:cs="Arial"/>
+        </w:rPr>
+        <w:t>Figura</w:t>
+      </w:r>
+      <w:proofErr w:type="spellEnd"/>
+      <w:r>
+        <w:rPr>
+          <w:rFonts w:ascii="Arial" w:hAnsi="Arial" w:cs="Arial"/>
+        </w:rPr>
+        <w:t xml:space="preserve"> 2. GHG </w:t>
+      </w:r>
+      <w:proofErr w:type="spellStart"/>
+      <w:r>
+        <w:rPr>
+          <w:rFonts w:ascii="Arial" w:hAnsi="Arial" w:cs="Arial"/>
+        </w:rPr>
+        <w:t>emissiones</w:t>
+      </w:r>
+      <w:proofErr w:type="spellEnd"/>
+      <w:r>
+        <w:rPr>
+          <w:rFonts w:ascii="Arial" w:hAnsi="Arial" w:cs="Arial"/>
         </w:rPr>
         <w:t xml:space="preserve"> </w:t>
       </w:r>
@@ -3208,7 +3218,6 @@
           <w:r>
             <w:rPr>
               <w:rFonts w:ascii="Arial" w:hAnsi="Arial" w:cs="Arial"/>
-              <w:lang w:val="pt-BR"/>
             </w:rPr>
             <w:instrText xml:space="preserve">CITATION HHo \l 1033 </w:instrText>
           </w:r>
@@ -3223,7 +3232,6 @@
             <w:rPr>
               <w:rFonts w:ascii="Arial" w:hAnsi="Arial" w:cs="Arial"/>
               <w:noProof/>
-              <w:lang w:val="pt-BR"/>
             </w:rPr>
             <w:t>(Timo, 2008)</w:t>
           </w:r>
@@ -3239,7 +3247,6 @@
       <w:r>
         <w:rPr>
           <w:rFonts w:ascii="Arial" w:hAnsi="Arial" w:cs="Arial"/>
-          <w:lang w:val="pt-BR"/>
         </w:rPr>
         <w:t>.</w:t>
       </w:r>
@@ -3263,6 +3270,12 @@
           <w:rFonts w:ascii="Arial" w:hAnsi="Arial" w:cs="Arial"/>
         </w:rPr>
         <w:t>f greenhouse gas (GHG) emissions have become increasingly important today due to the evolution of environmental regulatory frameworks that require organizations to quantify, report, control and mitigate the impact associated with their emissions</w:t>
+      </w:r>
+      <w:r>
+        <w:rPr>
+          <w:rFonts w:ascii="Arial" w:hAnsi="Arial" w:cs="Arial"/>
+        </w:rPr>
+        <w:t>,</w:t>
       </w:r>
       <w:r>
         <w:rPr>
@@ -3481,13 +3494,7 @@
         <w:rPr>
           <w:rFonts w:ascii="Arial" w:hAnsi="Arial" w:cs="Arial"/>
         </w:rPr>
-        <w:t>Historical business and environmental data can be used to identify patterns and relationships between corporate characteristics and greenhouse gas emissions. This presents an opportunity for data analysis and the development of predictive models to estimate future emissions; in turn, scenario analysis can be used to explore how changes in relevant variables might affect the projected emissions trajectory</w:t>
-      </w:r>
-      <w:r>
-        <w:rPr>
-          <w:rFonts w:ascii="Arial" w:hAnsi="Arial" w:cs="Arial"/>
-        </w:rPr>
-        <w:t>.</w:t>
+        <w:t>Historical business and environmental data can be used to identify patterns and relationships between corporate characteristics and greenhouse gas emissions. This presents an opportunity for data analysis and the development of predictive models to estimate future emissions; in turn, scenario analysis can be used to explore how changes in relevant variables might affect the projected emissions trajectory.</w:t>
       </w:r>
     </w:p>
     <w:p>
@@ -3524,15 +3531,64 @@
     <w:p>
       <w:pPr>
         <w:pStyle w:val="NormalWeb"/>
-        <w:rPr>
-          <w:rFonts w:ascii="Arial" w:hAnsi="Arial" w:cs="Arial"/>
-        </w:rPr>
-      </w:pPr>
-      <w:r>
-        <w:rPr>
-          <w:rFonts w:ascii="Arial" w:hAnsi="Arial" w:cs="Arial"/>
-        </w:rPr>
-        <w:t>Clearly define the business problem or challenge you intend to address. Explain its impact and how data analytics and predictive modelling can contribute towards addressing the problem.</w:t>
+        <w:jc w:val="both"/>
+        <w:rPr>
+          <w:rFonts w:ascii="Arial" w:hAnsi="Arial" w:cs="Arial"/>
+        </w:rPr>
+      </w:pPr>
+      <w:r>
+        <w:rPr>
+          <w:rFonts w:ascii="Arial" w:hAnsi="Arial" w:cs="Arial"/>
+        </w:rPr>
+        <w:t>Organizations are required to manage and reduce their environmental impact due to current regulatory frameworks and sustainability goals, while simultaneously maintaining their business operations and pursuing growth. In this context, companies need to consider how the evolution of their activities may affect their environmental performance</w:t>
+      </w:r>
+      <w:r>
+        <w:rPr>
+          <w:rFonts w:ascii="Arial" w:hAnsi="Arial" w:cs="Arial"/>
+        </w:rPr>
+        <w:t>, particularly</w:t>
+      </w:r>
+      <w:r>
+        <w:rPr>
+          <w:rFonts w:ascii="Arial" w:hAnsi="Arial" w:cs="Arial"/>
+        </w:rPr>
+        <w:t xml:space="preserve"> their greenhouse gas (GHG) emissions.</w:t>
+      </w:r>
+    </w:p>
+    <w:p>
+      <w:pPr>
+        <w:pStyle w:val="NormalWeb"/>
+        <w:jc w:val="both"/>
+        <w:rPr>
+          <w:rFonts w:ascii="Arial" w:hAnsi="Arial" w:cs="Arial"/>
+        </w:rPr>
+      </w:pPr>
+      <w:r>
+        <w:rPr>
+          <w:rFonts w:ascii="Arial" w:hAnsi="Arial" w:cs="Arial"/>
+        </w:rPr>
+        <w:t>Currently, organizations have historical data that provides valuable information about their emissions and allows them to assess their environmental performance. However, information on historical emissions alone does not allow for determining how a company’s future emissions might vary as its business activities and operational characteristics evolve.</w:t>
+      </w:r>
+    </w:p>
+    <w:p>
+      <w:pPr>
+        <w:pStyle w:val="NormalWeb"/>
+        <w:jc w:val="both"/>
+        <w:rPr>
+          <w:rFonts w:ascii="Arial" w:hAnsi="Arial" w:cs="Arial"/>
+        </w:rPr>
+      </w:pPr>
+      <w:r>
+        <w:rPr>
+          <w:rFonts w:ascii="Arial" w:hAnsi="Arial" w:cs="Arial"/>
+        </w:rPr>
+        <w:t>Therefore, the problem addressed by this project is the use of historical corporate and environmental data to predict future GHG emissions. While existing carbon accounting and reporting systems can provide information on past environmental performance, there is an opportunity to use this data to conduct predictive analyses and offer a forward-looking perspective that can be used to evaluate different alternatives and consider measures aimed at managing and reducing the environmental impact of business activities.</w:t>
+      </w:r>
+      <w:r>
+        <w:rPr>
+          <w:rFonts w:ascii="Arial" w:hAnsi="Arial" w:cs="Arial"/>
+        </w:rPr>
+        <w:t xml:space="preserve"> </w:t>
       </w:r>
     </w:p>
     <w:p>
@@ -3577,20 +3633,348 @@
         <w:rPr>
           <w:rFonts w:ascii="Arial" w:hAnsi="Arial" w:cs="Arial"/>
         </w:rPr>
-        <w:t xml:space="preserve">State the overall aim of the project and provide </w:t>
-      </w:r>
-      <w:r>
-        <w:rPr>
-          <w:rStyle w:val="Strong"/>
-          <w:rFonts w:ascii="Arial" w:hAnsi="Arial" w:cs="Arial"/>
-        </w:rPr>
-        <w:t>3–5 clear and achievable objectives</w:t>
-      </w:r>
-      <w:r>
-        <w:rPr>
-          <w:rFonts w:ascii="Arial" w:hAnsi="Arial" w:cs="Arial"/>
-        </w:rPr>
-        <w:t>. Include an appropriate business objective or hypothesis that will be explored through the project.</w:t>
+        <w:t>Aim</w:t>
+      </w:r>
+    </w:p>
+    <w:p>
+      <w:pPr>
+        <w:pStyle w:val="NormalWeb"/>
+        <w:numPr>
+          <w:ilvl w:val="0"/>
+          <w:numId w:val="2"/>
+        </w:numPr>
+        <w:jc w:val="both"/>
+        <w:rPr>
+          <w:rFonts w:ascii="Arial" w:hAnsi="Arial" w:cs="Arial"/>
+        </w:rPr>
+      </w:pPr>
+      <w:r>
+        <w:rPr>
+          <w:rFonts w:ascii="Arial" w:hAnsi="Arial" w:cs="Arial"/>
+        </w:rPr>
+        <w:lastRenderedPageBreak/>
+        <w:t xml:space="preserve">To determinate whether historical corporate and environmental data can be used to predict future </w:t>
+      </w:r>
+      <w:r>
+        <w:rPr>
+          <w:rFonts w:ascii="Arial" w:hAnsi="Arial" w:cs="Arial"/>
+        </w:rPr>
+        <w:t>tCO</w:t>
+      </w:r>
+      <w:r>
+        <w:rPr>
+          <w:rFonts w:ascii="Arial" w:hAnsi="Arial" w:cs="Arial"/>
+          <w:vertAlign w:val="subscript"/>
+        </w:rPr>
+        <w:t>2</w:t>
+      </w:r>
+      <w:r>
+        <w:rPr>
+          <w:rFonts w:ascii="Arial" w:hAnsi="Arial" w:cs="Arial"/>
+        </w:rPr>
+        <w:t>e emissions (considering only Scope 1 and Scope 2</w:t>
+      </w:r>
+      <w:r>
+        <w:rPr>
+          <w:rFonts w:ascii="Arial" w:hAnsi="Arial" w:cs="Arial"/>
+        </w:rPr>
+        <w:t xml:space="preserve"> greenhouse gas emissions</w:t>
+      </w:r>
+      <w:r>
+        <w:rPr>
+          <w:rFonts w:ascii="Arial" w:hAnsi="Arial" w:cs="Arial"/>
+        </w:rPr>
+        <w:t>)</w:t>
+      </w:r>
+      <w:r>
+        <w:rPr>
+          <w:rFonts w:ascii="Arial" w:hAnsi="Arial" w:cs="Arial"/>
+        </w:rPr>
+        <w:t xml:space="preserve"> </w:t>
+      </w:r>
+      <w:r>
+        <w:rPr>
+          <w:rFonts w:ascii="Arial" w:hAnsi="Arial" w:cs="Arial"/>
+        </w:rPr>
+        <w:t>and provide insights to support strategic sustainability planning</w:t>
+      </w:r>
+      <w:r>
+        <w:rPr>
+          <w:rFonts w:ascii="Arial" w:hAnsi="Arial" w:cs="Arial"/>
+        </w:rPr>
+        <w:t xml:space="preserve"> for </w:t>
+      </w:r>
+      <w:r>
+        <w:rPr>
+          <w:rFonts w:ascii="Arial" w:hAnsi="Arial" w:cs="Arial"/>
+        </w:rPr>
+        <w:t>manufacturing sector</w:t>
+      </w:r>
+      <w:r>
+        <w:rPr>
+          <w:rFonts w:ascii="Arial" w:hAnsi="Arial" w:cs="Arial"/>
+        </w:rPr>
+        <w:t>.</w:t>
+      </w:r>
+    </w:p>
+    <w:p>
+      <w:pPr>
+        <w:pStyle w:val="NormalWeb"/>
+        <w:rPr>
+          <w:rFonts w:ascii="Arial" w:hAnsi="Arial" w:cs="Arial"/>
+          <w:lang w:val="pt-BR"/>
+        </w:rPr>
+      </w:pPr>
+      <w:r>
+        <w:rPr>
+          <w:rFonts w:ascii="Arial" w:hAnsi="Arial" w:cs="Arial"/>
+          <w:lang w:val="pt-BR"/>
+        </w:rPr>
+        <w:t>Objectives</w:t>
+      </w:r>
+      <w:r>
+        <w:rPr>
+          <w:rFonts w:ascii="Arial" w:hAnsi="Arial" w:cs="Arial"/>
+          <w:lang w:val="pt-BR"/>
+        </w:rPr>
+        <w:t>:</w:t>
+      </w:r>
+    </w:p>
+    <w:p>
+      <w:pPr>
+        <w:pStyle w:val="NormalWeb"/>
+        <w:numPr>
+          <w:ilvl w:val="0"/>
+          <w:numId w:val="1"/>
+        </w:numPr>
+        <w:jc w:val="both"/>
+        <w:rPr>
+          <w:rFonts w:ascii="Arial" w:hAnsi="Arial" w:cs="Arial"/>
+        </w:rPr>
+      </w:pPr>
+      <w:r>
+        <w:rPr>
+          <w:rFonts w:ascii="Arial" w:hAnsi="Arial" w:cs="Arial"/>
+        </w:rPr>
+        <w:t>To collect, clean and i</w:t>
+      </w:r>
+      <w:r>
+        <w:rPr>
+          <w:rFonts w:ascii="Arial" w:hAnsi="Arial" w:cs="Arial"/>
+        </w:rPr>
+        <w:t>ntegrate relevant historical corporate and environmental data</w:t>
+      </w:r>
+      <w:r>
+        <w:rPr>
+          <w:rFonts w:ascii="Arial" w:hAnsi="Arial" w:cs="Arial"/>
+        </w:rPr>
+        <w:t xml:space="preserve"> of manufacturing sector</w:t>
+      </w:r>
+      <w:r>
+        <w:rPr>
+          <w:rFonts w:ascii="Arial" w:hAnsi="Arial" w:cs="Arial"/>
+        </w:rPr>
+        <w:t xml:space="preserve">, </w:t>
+      </w:r>
+      <w:r>
+        <w:rPr>
+          <w:rFonts w:ascii="Arial" w:hAnsi="Arial" w:cs="Arial"/>
+        </w:rPr>
+        <w:t>specifically regarding tCO</w:t>
+      </w:r>
+      <w:r>
+        <w:rPr>
+          <w:rFonts w:ascii="Arial" w:hAnsi="Arial" w:cs="Arial"/>
+          <w:vertAlign w:val="subscript"/>
+        </w:rPr>
+        <w:t>2</w:t>
+      </w:r>
+      <w:r>
+        <w:rPr>
+          <w:rFonts w:ascii="Arial" w:hAnsi="Arial" w:cs="Arial"/>
+        </w:rPr>
+        <w:t>e emissions (considering only Scope 1 and Scope 2 greenhouse gas emissions)</w:t>
+      </w:r>
+      <w:r>
+        <w:rPr>
+          <w:rFonts w:ascii="Arial" w:hAnsi="Arial" w:cs="Arial"/>
+        </w:rPr>
+        <w:t xml:space="preserve"> </w:t>
+      </w:r>
+      <w:r>
+        <w:rPr>
+          <w:rFonts w:ascii="Arial" w:hAnsi="Arial" w:cs="Arial"/>
+        </w:rPr>
+        <w:t xml:space="preserve">for </w:t>
+      </w:r>
+      <w:r>
+        <w:rPr>
+          <w:rFonts w:ascii="Arial" w:hAnsi="Arial" w:cs="Arial"/>
+        </w:rPr>
+        <w:t>manufacturing sector</w:t>
+      </w:r>
+      <w:r>
+        <w:rPr>
+          <w:rFonts w:ascii="Arial" w:hAnsi="Arial" w:cs="Arial"/>
+        </w:rPr>
+        <w:t>.</w:t>
+      </w:r>
+    </w:p>
+    <w:p>
+      <w:pPr>
+        <w:pStyle w:val="NormalWeb"/>
+        <w:numPr>
+          <w:ilvl w:val="0"/>
+          <w:numId w:val="1"/>
+        </w:numPr>
+        <w:jc w:val="both"/>
+        <w:rPr>
+          <w:rFonts w:ascii="Arial" w:hAnsi="Arial" w:cs="Arial"/>
+        </w:rPr>
+      </w:pPr>
+      <w:r>
+        <w:rPr>
+          <w:rFonts w:ascii="Arial" w:hAnsi="Arial" w:cs="Arial"/>
+        </w:rPr>
+        <w:t xml:space="preserve">To </w:t>
+      </w:r>
+      <w:r>
+        <w:rPr>
+          <w:rFonts w:ascii="Arial" w:hAnsi="Arial" w:cs="Arial"/>
+        </w:rPr>
+        <w:t>analyse historical patterns and relationships between corporate characteristics, such as revenue</w:t>
+      </w:r>
+      <w:r>
+        <w:rPr>
+          <w:rFonts w:ascii="Arial" w:hAnsi="Arial" w:cs="Arial"/>
+        </w:rPr>
+        <w:t xml:space="preserve"> or number of employees</w:t>
+      </w:r>
+      <w:r>
+        <w:rPr>
+          <w:rFonts w:ascii="Arial" w:hAnsi="Arial" w:cs="Arial"/>
+        </w:rPr>
+        <w:t>, and tCO2e emissions generated</w:t>
+      </w:r>
+      <w:r>
+        <w:rPr>
+          <w:rFonts w:ascii="Arial" w:hAnsi="Arial" w:cs="Arial"/>
+        </w:rPr>
+        <w:t xml:space="preserve">, </w:t>
+      </w:r>
+      <w:r>
+        <w:rPr>
+          <w:rFonts w:ascii="Arial" w:hAnsi="Arial" w:cs="Arial"/>
+        </w:rPr>
+        <w:t xml:space="preserve">for </w:t>
+      </w:r>
+      <w:r>
+        <w:rPr>
+          <w:rFonts w:ascii="Arial" w:hAnsi="Arial" w:cs="Arial"/>
+        </w:rPr>
+        <w:t>manufacturing sector</w:t>
+      </w:r>
+      <w:r>
+        <w:rPr>
+          <w:rFonts w:ascii="Arial" w:hAnsi="Arial" w:cs="Arial"/>
+        </w:rPr>
+        <w:t>.</w:t>
+      </w:r>
+    </w:p>
+    <w:p>
+      <w:pPr>
+        <w:pStyle w:val="NormalWeb"/>
+        <w:numPr>
+          <w:ilvl w:val="0"/>
+          <w:numId w:val="1"/>
+        </w:numPr>
+        <w:jc w:val="both"/>
+        <w:rPr>
+          <w:rFonts w:ascii="Arial" w:hAnsi="Arial" w:cs="Arial"/>
+        </w:rPr>
+      </w:pPr>
+      <w:r>
+        <w:rPr>
+          <w:rFonts w:ascii="Arial" w:hAnsi="Arial" w:cs="Arial"/>
+        </w:rPr>
+        <w:t xml:space="preserve">To develop a predictive model capable of </w:t>
+      </w:r>
+      <w:proofErr w:type="spellStart"/>
+      <w:r>
+        <w:rPr>
+          <w:rFonts w:ascii="Arial" w:hAnsi="Arial" w:cs="Arial"/>
+        </w:rPr>
+        <w:t>estimating</w:t>
+      </w:r>
+      <w:r>
+        <w:rPr>
+          <w:rFonts w:ascii="Arial" w:hAnsi="Arial" w:cs="Arial"/>
+        </w:rPr>
+        <w:t>e</w:t>
+      </w:r>
+      <w:proofErr w:type="spellEnd"/>
+      <w:r>
+        <w:rPr>
+          <w:rFonts w:ascii="Arial" w:hAnsi="Arial" w:cs="Arial"/>
+        </w:rPr>
+        <w:t xml:space="preserve"> future Scope 1 </w:t>
+      </w:r>
+      <w:proofErr w:type="gramStart"/>
+      <w:r>
+        <w:rPr>
+          <w:rFonts w:ascii="Arial" w:hAnsi="Arial" w:cs="Arial"/>
+        </w:rPr>
+        <w:t xml:space="preserve">and </w:t>
+      </w:r>
+      <w:r>
+        <w:rPr>
+          <w:rFonts w:ascii="Arial" w:hAnsi="Arial" w:cs="Arial"/>
+        </w:rPr>
+        <w:t xml:space="preserve"> </w:t>
+      </w:r>
+      <w:r>
+        <w:rPr>
+          <w:rFonts w:ascii="Arial" w:hAnsi="Arial" w:cs="Arial"/>
+        </w:rPr>
+        <w:t>tCO</w:t>
+      </w:r>
+      <w:proofErr w:type="gramEnd"/>
+      <w:r>
+        <w:rPr>
+          <w:rFonts w:ascii="Arial" w:hAnsi="Arial" w:cs="Arial"/>
+          <w:vertAlign w:val="subscript"/>
+        </w:rPr>
+        <w:t>2</w:t>
+      </w:r>
+      <w:r>
+        <w:rPr>
+          <w:rFonts w:ascii="Arial" w:hAnsi="Arial" w:cs="Arial"/>
+        </w:rPr>
+        <w:t>e emissions (considering only Scope 1 and Scope 2 greenhouse gas emissions)</w:t>
+      </w:r>
+      <w:r>
+        <w:rPr>
+          <w:rFonts w:ascii="Arial" w:hAnsi="Arial" w:cs="Arial"/>
+        </w:rPr>
+        <w:t xml:space="preserve">, </w:t>
+      </w:r>
+      <w:r>
+        <w:rPr>
+          <w:rFonts w:ascii="Arial" w:hAnsi="Arial" w:cs="Arial"/>
+        </w:rPr>
+        <w:t xml:space="preserve">for </w:t>
+      </w:r>
+      <w:r>
+        <w:rPr>
+          <w:rFonts w:ascii="Arial" w:hAnsi="Arial" w:cs="Arial"/>
+        </w:rPr>
+        <w:t>manufacturing sector</w:t>
+      </w:r>
+      <w:r>
+        <w:rPr>
+          <w:rFonts w:ascii="Arial" w:hAnsi="Arial" w:cs="Arial"/>
+        </w:rPr>
+        <w:t>.</w:t>
       </w:r>
     </w:p>
     <w:p>
@@ -3601,6 +3985,7 @@
           <w:b/>
           <w:bCs/>
           <w:color w:val="auto"/>
+          <w:lang w:val="pt-BR"/>
         </w:rPr>
       </w:pPr>
       <w:bookmarkStart w:id="5" w:name="_Toc241617507"/>
@@ -3610,6 +3995,7 @@
           <w:b/>
           <w:bCs/>
           <w:color w:val="auto"/>
+          <w:lang w:val="pt-BR"/>
         </w:rPr>
         <w:t>V</w:t>
       </w:r>
@@ -3619,6 +4005,7 @@
           <w:b/>
           <w:bCs/>
           <w:color w:val="auto"/>
+          <w:lang w:val="pt-BR"/>
         </w:rPr>
         <w:t>. Scope</w:t>
       </w:r>
@@ -3627,28 +4014,108 @@
     <w:p>
       <w:pPr>
         <w:pStyle w:val="NormalWeb"/>
-        <w:rPr>
-          <w:rFonts w:ascii="Arial" w:hAnsi="Arial" w:cs="Arial"/>
-        </w:rPr>
-      </w:pPr>
-      <w:r>
-        <w:rPr>
-          <w:rFonts w:ascii="Arial" w:hAnsi="Arial" w:cs="Arial"/>
-        </w:rPr>
-        <w:t xml:space="preserve">Clearly define what will be </w:t>
-      </w:r>
-      <w:r>
-        <w:rPr>
-          <w:rStyle w:val="Strong"/>
-          <w:rFonts w:ascii="Arial" w:hAnsi="Arial" w:cs="Arial"/>
-        </w:rPr>
-        <w:t>included and excluded</w:t>
-      </w:r>
-      <w:r>
-        <w:rPr>
-          <w:rFonts w:ascii="Arial" w:hAnsi="Arial" w:cs="Arial"/>
-        </w:rPr>
-        <w:t xml:space="preserve"> from the project. The proposed work should have sufficient scope for investigation and development across two semesters.</w:t>
+        <w:jc w:val="both"/>
+        <w:rPr>
+          <w:rFonts w:ascii="Arial" w:hAnsi="Arial" w:cs="Arial"/>
+        </w:rPr>
+      </w:pPr>
+      <w:r>
+        <w:rPr>
+          <w:rFonts w:ascii="Arial" w:hAnsi="Arial" w:cs="Arial"/>
+        </w:rPr>
+        <w:t xml:space="preserve">This project will focus on the application of data analysis and predictive </w:t>
+      </w:r>
+      <w:proofErr w:type="spellStart"/>
+      <w:r>
+        <w:rPr>
+          <w:rFonts w:ascii="Arial" w:hAnsi="Arial" w:cs="Arial"/>
+        </w:rPr>
+        <w:t>modeling</w:t>
+      </w:r>
+      <w:proofErr w:type="spellEnd"/>
+      <w:r>
+        <w:rPr>
+          <w:rFonts w:ascii="Arial" w:hAnsi="Arial" w:cs="Arial"/>
+        </w:rPr>
+        <w:t xml:space="preserve"> using historical recorded </w:t>
+      </w:r>
+      <w:proofErr w:type="spellStart"/>
+      <w:r>
+        <w:rPr>
+          <w:rFonts w:ascii="Arial" w:hAnsi="Arial" w:cs="Arial"/>
+        </w:rPr>
+        <w:t>tCO</w:t>
+      </w:r>
+      <w:r>
+        <w:rPr>
+          <w:rFonts w:ascii="Cambria Math" w:hAnsi="Cambria Math" w:cs="Cambria Math"/>
+        </w:rPr>
+        <w:t>₂</w:t>
+      </w:r>
+      <w:r>
+        <w:rPr>
+          <w:rFonts w:ascii="Arial" w:hAnsi="Arial" w:cs="Arial"/>
+        </w:rPr>
+        <w:t>e</w:t>
+      </w:r>
+      <w:proofErr w:type="spellEnd"/>
+      <w:r>
+        <w:rPr>
+          <w:rFonts w:ascii="Arial" w:hAnsi="Arial" w:cs="Arial"/>
+        </w:rPr>
+        <w:t xml:space="preserve"> emissions from companies in the manufacturing sector, as well as other relevant business characteristics (such as revenue or number of employees, to name a few), provided they are available in the selected databases. The availability and completeness of these variables will be assessed during the data preparation phase</w:t>
+      </w:r>
+      <w:r>
+        <w:rPr>
+          <w:rFonts w:ascii="Arial" w:hAnsi="Arial" w:cs="Arial"/>
+        </w:rPr>
+        <w:t>.</w:t>
+      </w:r>
+    </w:p>
+    <w:p>
+      <w:pPr>
+        <w:pStyle w:val="NormalWeb"/>
+        <w:rPr>
+          <w:rFonts w:ascii="Arial" w:hAnsi="Arial" w:cs="Arial"/>
+        </w:rPr>
+      </w:pPr>
+      <w:r>
+        <w:rPr>
+          <w:rFonts w:ascii="Arial" w:hAnsi="Arial" w:cs="Arial"/>
+        </w:rPr>
+        <w:t xml:space="preserve">The project will be based on </w:t>
+      </w:r>
+      <w:proofErr w:type="spellStart"/>
+      <w:r>
+        <w:rPr>
+          <w:rFonts w:ascii="Arial" w:hAnsi="Arial" w:cs="Arial"/>
+        </w:rPr>
+        <w:t>tCO</w:t>
+      </w:r>
+      <w:r>
+        <w:rPr>
+          <w:rFonts w:ascii="Cambria Math" w:hAnsi="Cambria Math" w:cs="Cambria Math"/>
+        </w:rPr>
+        <w:t>₂</w:t>
+      </w:r>
+      <w:r>
+        <w:rPr>
+          <w:rFonts w:ascii="Arial" w:hAnsi="Arial" w:cs="Arial"/>
+        </w:rPr>
+        <w:t>e</w:t>
+      </w:r>
+      <w:proofErr w:type="spellEnd"/>
+      <w:r>
+        <w:rPr>
+          <w:rFonts w:ascii="Arial" w:hAnsi="Arial" w:cs="Arial"/>
+        </w:rPr>
+        <w:t xml:space="preserve"> emissions, which include only Scope 1 and Scope 2. For this project, Scope 3 will be completely excluded and will not be used.</w:t>
+      </w:r>
+      <w:r>
+        <w:rPr>
+          <w:rFonts w:ascii="Arial" w:hAnsi="Arial" w:cs="Arial"/>
+        </w:rPr>
+        <w:t xml:space="preserve"> </w:t>
       </w:r>
     </w:p>
     <w:p>
@@ -3707,7 +4174,6 @@
         <w:rPr>
           <w:rFonts w:ascii="Arial" w:hAnsi="Arial" w:cs="Arial"/>
         </w:rPr>
-        <w:lastRenderedPageBreak/>
         <w:t xml:space="preserve">Include a </w:t>
       </w:r>
       <w:r>
@@ -3787,6 +4253,7 @@
           <w:bCs/>
           <w:color w:val="auto"/>
         </w:rPr>
+        <w:lastRenderedPageBreak/>
         <w:t>VIII</w:t>
       </w:r>
       <w:r>
@@ -4117,7 +4584,6 @@
                   <w:noProof/>
                   <w:sz w:val="24"/>
                   <w:szCs w:val="24"/>
-                  <w:lang w:val="en-GB"/>
                 </w:rPr>
               </w:pPr>
               <w:r>
@@ -4132,7 +4598,50 @@
               <w:r>
                 <w:rPr>
                   <w:noProof/>
-                  <w:lang w:val="en-GB"/>
+                </w:rPr>
+                <w:t>Environmental Protection Agency (EPA). (2012, September 14). The Carbon Cycle. United States.</w:t>
+              </w:r>
+            </w:p>
+            <w:p>
+              <w:pPr>
+                <w:pStyle w:val="Bibliography"/>
+                <w:ind w:left="720" w:hanging="720"/>
+                <w:rPr>
+                  <w:noProof/>
+                </w:rPr>
+              </w:pPr>
+              <w:r>
+                <w:rPr>
+                  <w:noProof/>
+                </w:rPr>
+                <w:t xml:space="preserve">Environmental Protection Agency (EPA). (2013, September 9). </w:t>
+              </w:r>
+              <w:r>
+                <w:rPr>
+                  <w:i/>
+                  <w:iCs/>
+                  <w:noProof/>
+                </w:rPr>
+                <w:t>Climate Change Terms</w:t>
+              </w:r>
+              <w:r>
+                <w:rPr>
+                  <w:noProof/>
+                </w:rPr>
+                <w:t>. Retrieved from EPA's climate change: https://sor.epa.gov/sor_internet/registry/termreg/searchandretrieve/glossariesandkeywordlists/search.do?details=&amp;vocabName=Glossary%20Climate%20Change%20Terms&amp;filterTerm=carbon%20cycle&amp;checkedAcronym=false&amp;checkedTerm=false&amp;hasDefinitions=false&amp;filterTerm</w:t>
+              </w:r>
+            </w:p>
+            <w:p>
+              <w:pPr>
+                <w:pStyle w:val="Bibliography"/>
+                <w:ind w:left="720" w:hanging="720"/>
+                <w:rPr>
+                  <w:noProof/>
+                </w:rPr>
+              </w:pPr>
+              <w:r>
+                <w:rPr>
+                  <w:noProof/>
                 </w:rPr>
                 <w:t xml:space="preserve">EPA. (2026, January 23). </w:t>
               </w:r>
@@ -4141,16 +4650,137 @@
                   <w:i/>
                   <w:iCs/>
                   <w:noProof/>
-                  <w:lang w:val="en-GB"/>
                 </w:rPr>
                 <w:t>Environmental Protection Agency</w:t>
               </w:r>
               <w:r>
                 <w:rPr>
                   <w:noProof/>
-                  <w:lang w:val="en-GB"/>
                 </w:rPr>
                 <w:t>. Retrieved from Greenhouse Gas Emissions: https://www.epa.gov/ghgemissions/carbon-dioxide-emissions</w:t>
+              </w:r>
+            </w:p>
+            <w:p>
+              <w:pPr>
+                <w:pStyle w:val="Bibliography"/>
+                <w:ind w:left="720" w:hanging="720"/>
+                <w:rPr>
+                  <w:noProof/>
+                </w:rPr>
+              </w:pPr>
+              <w:r>
+                <w:rPr>
+                  <w:noProof/>
+                </w:rPr>
+                <w:t xml:space="preserve">Habeeb Fadya A., A. H. (2024, November 25). </w:t>
+              </w:r>
+              <w:r>
+                <w:rPr>
+                  <w:i/>
+                  <w:iCs/>
+                  <w:noProof/>
+                </w:rPr>
+                <w:t>Global Analysis and Prediction of CO2 and Greenhouse Gas Emissions across Continents .</w:t>
+              </w:r>
+              <w:r>
+                <w:rPr>
+                  <w:noProof/>
+                </w:rPr>
+                <w:t xml:space="preserve"> Retrieved from ARTICLEINFO: https://www.bing.com/ck/a?!&amp;&amp;p=3a2c4c3c80f3c636645997da40ee3de7babee04b043e6f7</w:t>
+              </w:r>
+              <w:r>
+                <w:rPr>
+                  <w:noProof/>
+                </w:rPr>
+                <w:lastRenderedPageBreak/>
+                <w:t>224ecd54831762cc0JmltdHM9MTc5MDg5OTIwMA&amp;ptn=3&amp;ver=2&amp;hsh=4&amp;fclid=08ab4975-cd86-6830-1003-5e52ccfd69e7&amp;psq=Global+Analysis+and+Prediction+of+CO2+and+Greenhouse+Gas+Emissions+acros</w:t>
+              </w:r>
+            </w:p>
+            <w:p>
+              <w:pPr>
+                <w:pStyle w:val="Bibliography"/>
+                <w:ind w:left="720" w:hanging="720"/>
+                <w:rPr>
+                  <w:noProof/>
+                </w:rPr>
+              </w:pPr>
+              <w:r>
+                <w:rPr>
+                  <w:noProof/>
+                </w:rPr>
+                <w:t xml:space="preserve">John Downie, W. S. (2011, September 24). </w:t>
+              </w:r>
+              <w:r>
+                <w:rPr>
+                  <w:i/>
+                  <w:iCs/>
+                  <w:noProof/>
+                </w:rPr>
+                <w:t>Evaluation of Australian companies’ scope 3 greenhouse gas.</w:t>
+              </w:r>
+              <w:r>
+                <w:rPr>
+                  <w:noProof/>
+                </w:rPr>
+                <w:t xml:space="preserve"> Retrieved from ELSEVIER: https://www.sciencedirect.com/science/article/abs/pii/S0959652611003416</w:t>
+              </w:r>
+            </w:p>
+            <w:p>
+              <w:pPr>
+                <w:pStyle w:val="Bibliography"/>
+                <w:ind w:left="720" w:hanging="720"/>
+                <w:rPr>
+                  <w:noProof/>
+                </w:rPr>
+              </w:pPr>
+              <w:r>
+                <w:rPr>
+                  <w:noProof/>
+                </w:rPr>
+                <w:t xml:space="preserve">Rainer Kasperzak, M. K. (2023, January 5). </w:t>
+              </w:r>
+              <w:r>
+                <w:rPr>
+                  <w:i/>
+                  <w:iCs/>
+                  <w:noProof/>
+                </w:rPr>
+                <w:t>Accounting for Carbon Emissions—Current State of Sustainability Reporting Practice under the GHG Protocol.</w:t>
+              </w:r>
+              <w:r>
+                <w:rPr>
+                  <w:noProof/>
+                </w:rPr>
+                <w:t xml:space="preserve"> Retrieved from https://www.mdpi.com/2071-1050/15/2/994</w:t>
+              </w:r>
+            </w:p>
+            <w:p>
+              <w:pPr>
+                <w:pStyle w:val="Bibliography"/>
+                <w:ind w:left="720" w:hanging="720"/>
+                <w:rPr>
+                  <w:noProof/>
+                </w:rPr>
+              </w:pPr>
+              <w:r>
+                <w:rPr>
+                  <w:noProof/>
+                </w:rPr>
+                <w:t xml:space="preserve">Timo, H. H. (2008). Corporate Carbon Performance Indicators: Carbon Intensity, Dependency, Exposure and Risk. </w:t>
+              </w:r>
+              <w:r>
+                <w:rPr>
+                  <w:i/>
+                  <w:iCs/>
+                  <w:noProof/>
+                </w:rPr>
+                <w:t>Journal of Industrial Ecology</w:t>
+              </w:r>
+              <w:r>
+                <w:rPr>
+                  <w:noProof/>
+                </w:rPr>
+                <w:t>, 505-520.</w:t>
               </w:r>
             </w:p>
             <w:p>
@@ -4307,7 +4937,7 @@
       </w:r>
     </w:p>
     <w:sectPr>
-      <w:footerReference w:type="default" r:id="rId10"/>
+      <w:footerReference w:type="default" r:id="rId11"/>
       <w:pgSz w:w="11906" w:h="16838"/>
       <w:pgMar w:top="1440" w:right="1440" w:bottom="1440" w:left="1440" w:header="708" w:footer="708" w:gutter="0"/>
       <w:pgNumType w:start="1"/>
@@ -4412,6 +5042,243 @@
     </w:p>
   </w:footnote>
 </w:footnotes>
+</file>
+
+<file path=word/numbering.xml><?xml version="1.0" encoding="utf-8"?>
+<w:numbering xmlns:wpc="http://schemas.microsoft.com/office/word/2010/wordprocessingCanvas" xmlns:cx="http://schemas.microsoft.com/office/drawing/2014/chartex" xmlns:cx1="http://schemas.microsoft.com/office/drawing/2015/9/8/chartex" xmlns:cx2="http://schemas.microsoft.com/office/drawing/2015/10/21/chartex" xmlns:cx3="http://schemas.microsoft.com/office/drawing/2016/5/9/chartex" xmlns:cx4="http://schemas.microsoft.com/office/drawing/2016/5/10/chartex" xmlns:cx5="http://schemas.microsoft.com/office/drawing/2016/5/11/chartex" xmlns:cx6="http://schemas.microsoft.com/office/drawing/2016/5/12/chartex" xmlns:cx7="http://schemas.microsoft.com/office/drawing/2016/5/13/chartex" xmlns:cx8="http://schemas.microsoft.com/office/drawing/2016/5/14/chartex" xmlns:mc="http://schemas.openxmlformats.org/markup-compatibility/2006" xmlns:aink="http://schemas.microsoft.com/office/drawing/2016/ink" xmlns:am3d="http://schemas.microsoft.com/office/drawing/2017/model3d" xmlns:o="urn:schemas-microsoft-com:office:office" xmlns:oel="http://schemas.microsoft.com/office/2019/extlst" xmlns:r="http://schemas.openxmlformats.org/officeDocument/2006/relationships" xmlns:m="http://schemas.openxmlformats.org/officeDocument/2006/math" xmlns:v="urn:schemas-microsoft-com:vml" xmlns:wp14="http://schemas.microsoft.com/office/word/2010/wordprocessingDrawing" xmlns:wp="http://schemas.openxmlformats.org/drawingml/2006/wordprocessingDrawing" xmlns:w10="urn:schemas-microsoft-com:office:word" xmlns:w="http://schemas.openxmlformats.org/wordprocessingml/2006/main" xmlns:w14="http://schemas.microsoft.com/office/word/2010/wordml" xmlns:w15="http://schemas.microsoft.com/office/word/2012/wordml" xmlns:w16cex="http://schemas.microsoft.com/office/word/2018/wordml/cex" xmlns:w16cid="http://schemas.microsoft.com/office/word/2016/wordml/cid" xmlns:w16="http://schemas.microsoft.com/office/word/2018/wordml" xmlns:w16du="http://schemas.microsoft.com/office/word/2023/wordml/word16du" xmlns:w16sdtdh="http://schemas.microsoft.com/office/word/2020/wordml/sdtdatahash" xmlns:w16sdtfl="http://schemas.microsoft.com/office/word/2024/wordml/sdtformatlock" xmlns:w16se="http://schemas.microsoft.com/office/word/2015/wordml/symex" xmlns:wpg="http://schemas.microsoft.com/office/word/2010/wordprocessingGroup" xmlns:wpi="http://schemas.microsoft.com/office/word/2010/wordprocessingInk" xmlns:wne="http://schemas.microsoft.com/office/word/2006/wordml" xmlns:wps="http://schemas.microsoft.com/office/word/2010/wordprocessingShape" mc:Ignorable="w14 w15 w16se w16cid w16 w16cex w16sdtdh w16sdtfl w16du wp14">
+  <w:abstractNum w:abstractNumId="0" w15:restartNumberingAfterBreak="0">
+    <w:nsid w:val="60F736BC"/>
+    <w:multiLevelType w:val="hybridMultilevel"/>
+    <w:tmpl w:val="1A60344A"/>
+    <w:lvl w:ilvl="0" w:tplc="18090001">
+      <w:start w:val="1"/>
+      <w:numFmt w:val="bullet"/>
+      <w:lvlText w:val=""/>
+      <w:lvlJc w:val="left"/>
+      <w:pPr>
+        <w:ind w:left="720" w:hanging="360"/>
+      </w:pPr>
+      <w:rPr>
+        <w:rFonts w:ascii="Symbol" w:hAnsi="Symbol" w:hint="default"/>
+      </w:rPr>
+    </w:lvl>
+    <w:lvl w:ilvl="1" w:tplc="18090003" w:tentative="1">
+      <w:start w:val="1"/>
+      <w:numFmt w:val="bullet"/>
+      <w:lvlText w:val="o"/>
+      <w:lvlJc w:val="left"/>
+      <w:pPr>
+        <w:ind w:left="1440" w:hanging="360"/>
+      </w:pPr>
+      <w:rPr>
+        <w:rFonts w:ascii="Courier New" w:hAnsi="Courier New" w:cs="Courier New" w:hint="default"/>
+      </w:rPr>
+    </w:lvl>
+    <w:lvl w:ilvl="2" w:tplc="18090005" w:tentative="1">
+      <w:start w:val="1"/>
+      <w:numFmt w:val="bullet"/>
+      <w:lvlText w:val=""/>
+      <w:lvlJc w:val="left"/>
+      <w:pPr>
+        <w:ind w:left="2160" w:hanging="360"/>
+      </w:pPr>
+      <w:rPr>
+        <w:rFonts w:ascii="Wingdings" w:hAnsi="Wingdings" w:hint="default"/>
+      </w:rPr>
+    </w:lvl>
+    <w:lvl w:ilvl="3" w:tplc="18090001" w:tentative="1">
+      <w:start w:val="1"/>
+      <w:numFmt w:val="bullet"/>
+      <w:lvlText w:val=""/>
+      <w:lvlJc w:val="left"/>
+      <w:pPr>
+        <w:ind w:left="2880" w:hanging="360"/>
+      </w:pPr>
+      <w:rPr>
+        <w:rFonts w:ascii="Symbol" w:hAnsi="Symbol" w:hint="default"/>
+      </w:rPr>
+    </w:lvl>
+    <w:lvl w:ilvl="4" w:tplc="18090003" w:tentative="1">
+      <w:start w:val="1"/>
+      <w:numFmt w:val="bullet"/>
+      <w:lvlText w:val="o"/>
+      <w:lvlJc w:val="left"/>
+      <w:pPr>
+        <w:ind w:left="3600" w:hanging="360"/>
+      </w:pPr>
+      <w:rPr>
+        <w:rFonts w:ascii="Courier New" w:hAnsi="Courier New" w:cs="Courier New" w:hint="default"/>
+      </w:rPr>
+    </w:lvl>
+    <w:lvl w:ilvl="5" w:tplc="18090005" w:tentative="1">
+      <w:start w:val="1"/>
+      <w:numFmt w:val="bullet"/>
+      <w:lvlText w:val=""/>
+      <w:lvlJc w:val="left"/>
+      <w:pPr>
+        <w:ind w:left="4320" w:hanging="360"/>
+      </w:pPr>
+      <w:rPr>
+        <w:rFonts w:ascii="Wingdings" w:hAnsi="Wingdings" w:hint="default"/>
+      </w:rPr>
+    </w:lvl>
+    <w:lvl w:ilvl="6" w:tplc="18090001" w:tentative="1">
+      <w:start w:val="1"/>
+      <w:numFmt w:val="bullet"/>
+      <w:lvlText w:val=""/>
+      <w:lvlJc w:val="left"/>
+      <w:pPr>
+        <w:ind w:left="5040" w:hanging="360"/>
+      </w:pPr>
+      <w:rPr>
+        <w:rFonts w:ascii="Symbol" w:hAnsi="Symbol" w:hint="default"/>
+      </w:rPr>
+    </w:lvl>
+    <w:lvl w:ilvl="7" w:tplc="18090003" w:tentative="1">
+      <w:start w:val="1"/>
+      <w:numFmt w:val="bullet"/>
+      <w:lvlText w:val="o"/>
+      <w:lvlJc w:val="left"/>
+      <w:pPr>
+        <w:ind w:left="5760" w:hanging="360"/>
+      </w:pPr>
+      <w:rPr>
+        <w:rFonts w:ascii="Courier New" w:hAnsi="Courier New" w:cs="Courier New" w:hint="default"/>
+      </w:rPr>
+    </w:lvl>
+    <w:lvl w:ilvl="8" w:tplc="18090005" w:tentative="1">
+      <w:start w:val="1"/>
+      <w:numFmt w:val="bullet"/>
+      <w:lvlText w:val=""/>
+      <w:lvlJc w:val="left"/>
+      <w:pPr>
+        <w:ind w:left="6480" w:hanging="360"/>
+      </w:pPr>
+      <w:rPr>
+        <w:rFonts w:ascii="Wingdings" w:hAnsi="Wingdings" w:hint="default"/>
+      </w:rPr>
+    </w:lvl>
+  </w:abstractNum>
+  <w:abstractNum w:abstractNumId="1" w15:restartNumberingAfterBreak="0">
+    <w:nsid w:val="6B3B0034"/>
+    <w:multiLevelType w:val="hybridMultilevel"/>
+    <w:tmpl w:val="F7DA2040"/>
+    <w:lvl w:ilvl="0" w:tplc="18090001">
+      <w:start w:val="1"/>
+      <w:numFmt w:val="bullet"/>
+      <w:lvlText w:val=""/>
+      <w:lvlJc w:val="left"/>
+      <w:pPr>
+        <w:ind w:left="720" w:hanging="360"/>
+      </w:pPr>
+      <w:rPr>
+        <w:rFonts w:ascii="Symbol" w:hAnsi="Symbol" w:hint="default"/>
+      </w:rPr>
+    </w:lvl>
+    <w:lvl w:ilvl="1" w:tplc="18090003" w:tentative="1">
+      <w:start w:val="1"/>
+      <w:numFmt w:val="bullet"/>
+      <w:lvlText w:val="o"/>
+      <w:lvlJc w:val="left"/>
+      <w:pPr>
+        <w:ind w:left="1440" w:hanging="360"/>
+      </w:pPr>
+      <w:rPr>
+        <w:rFonts w:ascii="Courier New" w:hAnsi="Courier New" w:cs="Courier New" w:hint="default"/>
+      </w:rPr>
+    </w:lvl>
+    <w:lvl w:ilvl="2" w:tplc="18090005" w:tentative="1">
+      <w:start w:val="1"/>
+      <w:numFmt w:val="bullet"/>
+      <w:lvlText w:val=""/>
+      <w:lvlJc w:val="left"/>
+      <w:pPr>
+        <w:ind w:left="2160" w:hanging="360"/>
+      </w:pPr>
+      <w:rPr>
+        <w:rFonts w:ascii="Wingdings" w:hAnsi="Wingdings" w:hint="default"/>
+      </w:rPr>
+    </w:lvl>
+    <w:lvl w:ilvl="3" w:tplc="18090001" w:tentative="1">
+      <w:start w:val="1"/>
+      <w:numFmt w:val="bullet"/>
+      <w:lvlText w:val=""/>
+      <w:lvlJc w:val="left"/>
+      <w:pPr>
+        <w:ind w:left="2880" w:hanging="360"/>
+      </w:pPr>
+      <w:rPr>
+        <w:rFonts w:ascii="Symbol" w:hAnsi="Symbol" w:hint="default"/>
+      </w:rPr>
+    </w:lvl>
+    <w:lvl w:ilvl="4" w:tplc="18090003" w:tentative="1">
+      <w:start w:val="1"/>
+      <w:numFmt w:val="bullet"/>
+      <w:lvlText w:val="o"/>
+      <w:lvlJc w:val="left"/>
+      <w:pPr>
+        <w:ind w:left="3600" w:hanging="360"/>
+      </w:pPr>
+      <w:rPr>
+        <w:rFonts w:ascii="Courier New" w:hAnsi="Courier New" w:cs="Courier New" w:hint="default"/>
+      </w:rPr>
+    </w:lvl>
+    <w:lvl w:ilvl="5" w:tplc="18090005" w:tentative="1">
+      <w:start w:val="1"/>
+      <w:numFmt w:val="bullet"/>
+      <w:lvlText w:val=""/>
+      <w:lvlJc w:val="left"/>
+      <w:pPr>
+        <w:ind w:left="4320" w:hanging="360"/>
+      </w:pPr>
+      <w:rPr>
+        <w:rFonts w:ascii="Wingdings" w:hAnsi="Wingdings" w:hint="default"/>
+      </w:rPr>
+    </w:lvl>
+    <w:lvl w:ilvl="6" w:tplc="18090001" w:tentative="1">
+      <w:start w:val="1"/>
+      <w:numFmt w:val="bullet"/>
+      <w:lvlText w:val=""/>
+      <w:lvlJc w:val="left"/>
+      <w:pPr>
+        <w:ind w:left="5040" w:hanging="360"/>
+      </w:pPr>
+      <w:rPr>
+        <w:rFonts w:ascii="Symbol" w:hAnsi="Symbol" w:hint="default"/>
+      </w:rPr>
+    </w:lvl>
+    <w:lvl w:ilvl="7" w:tplc="18090003" w:tentative="1">
+      <w:start w:val="1"/>
+      <w:numFmt w:val="bullet"/>
+      <w:lvlText w:val="o"/>
+      <w:lvlJc w:val="left"/>
+      <w:pPr>
+        <w:ind w:left="5760" w:hanging="360"/>
+      </w:pPr>
+      <w:rPr>
+        <w:rFonts w:ascii="Courier New" w:hAnsi="Courier New" w:cs="Courier New" w:hint="default"/>
+      </w:rPr>
+    </w:lvl>
+    <w:lvl w:ilvl="8" w:tplc="18090005" w:tentative="1">
+      <w:start w:val="1"/>
+      <w:numFmt w:val="bullet"/>
+      <w:lvlText w:val=""/>
+      <w:lvlJc w:val="left"/>
+      <w:pPr>
+        <w:ind w:left="6480" w:hanging="360"/>
+      </w:pPr>
+      <w:rPr>
+        <w:rFonts w:ascii="Wingdings" w:hAnsi="Wingdings" w:hint="default"/>
+      </w:rPr>
+    </w:lvl>
+  </w:abstractNum>
+  <w:num w:numId="1" w16cid:durableId="1579055741">
+    <w:abstractNumId w:val="1"/>
+  </w:num>
+  <w:num w:numId="2" w16cid:durableId="1884246090">
+    <w:abstractNumId w:val="0"/>
+  </w:num>
+</w:numbering>
 </file>
 
 <file path=word/styles.xml><?xml version="1.0" encoding="utf-8"?>

</xml_diff>

<commit_message>
advances in methodology and data sources
</commit_message>
<xml_diff>
--- a/CA1-ANDREA DIAZ MEDRANO.docx
+++ b/CA1-ANDREA DIAZ MEDRANO.docx
@@ -3126,9 +3126,9 @@
           <w:lang w:val="pt-BR"/>
         </w:rPr>
         <w:drawing>
-          <wp:inline distT="0" distB="0" distL="0" distR="0" wp14:anchorId="3267687A" wp14:editId="441FE344">
-            <wp:extent cx="5494496" cy="2331922"/>
-            <wp:effectExtent l="0" t="0" r="0" b="0"/>
+          <wp:inline distT="0" distB="0" distL="0" distR="0" wp14:anchorId="3267687A" wp14:editId="02BC7BCB">
+            <wp:extent cx="5691517" cy="2415540"/>
+            <wp:effectExtent l="0" t="0" r="4445" b="3810"/>
             <wp:docPr id="1784026794" name="Picture 1"/>
             <wp:cNvGraphicFramePr>
               <a:graphicFrameLocks xmlns:a="http://schemas.openxmlformats.org/drawingml/2006/main" noChangeAspect="1"/>
@@ -3149,7 +3149,7 @@
                   <pic:spPr>
                     <a:xfrm>
                       <a:off x="0" y="0"/>
-                      <a:ext cx="5494496" cy="2331922"/>
+                      <a:ext cx="5694558" cy="2416831"/>
                     </a:xfrm>
                     <a:prstGeom prst="rect">
                       <a:avLst/>
@@ -3672,25 +3672,7 @@
         <w:rPr>
           <w:rFonts w:ascii="Arial" w:hAnsi="Arial" w:cs="Arial"/>
         </w:rPr>
-        <w:t>e emissions (considering only Scope 1 and Scope 2</w:t>
-      </w:r>
-      <w:r>
-        <w:rPr>
-          <w:rFonts w:ascii="Arial" w:hAnsi="Arial" w:cs="Arial"/>
-        </w:rPr>
-        <w:t xml:space="preserve"> greenhouse gas emissions</w:t>
-      </w:r>
-      <w:r>
-        <w:rPr>
-          <w:rFonts w:ascii="Arial" w:hAnsi="Arial" w:cs="Arial"/>
-        </w:rPr>
-        <w:t>)</w:t>
-      </w:r>
-      <w:r>
-        <w:rPr>
-          <w:rFonts w:ascii="Arial" w:hAnsi="Arial" w:cs="Arial"/>
-        </w:rPr>
-        <w:t xml:space="preserve"> </w:t>
+        <w:t xml:space="preserve">e emissions (considering only Scope 1 and Scope 2 greenhouse gas emissions) </w:t>
       </w:r>
       <w:r>
         <w:rPr>
@@ -3799,13 +3781,7 @@
         <w:rPr>
           <w:rFonts w:ascii="Arial" w:hAnsi="Arial" w:cs="Arial"/>
         </w:rPr>
-        <w:t xml:space="preserve"> </w:t>
-      </w:r>
-      <w:r>
-        <w:rPr>
-          <w:rFonts w:ascii="Arial" w:hAnsi="Arial" w:cs="Arial"/>
-        </w:rPr>
-        <w:t xml:space="preserve">for </w:t>
+        <w:t xml:space="preserve"> for </w:t>
       </w:r>
       <w:r>
         <w:rPr>
@@ -3860,13 +3836,7 @@
         <w:rPr>
           <w:rFonts w:ascii="Arial" w:hAnsi="Arial" w:cs="Arial"/>
         </w:rPr>
-        <w:t xml:space="preserve">, </w:t>
-      </w:r>
-      <w:r>
-        <w:rPr>
-          <w:rFonts w:ascii="Arial" w:hAnsi="Arial" w:cs="Arial"/>
-        </w:rPr>
-        <w:t xml:space="preserve">for </w:t>
+        <w:t xml:space="preserve">, for </w:t>
       </w:r>
       <w:r>
         <w:rPr>
@@ -3917,14 +3887,7 @@
         <w:rPr>
           <w:rFonts w:ascii="Arial" w:hAnsi="Arial" w:cs="Arial"/>
         </w:rPr>
-        <w:t xml:space="preserve"> future Scope 1 </w:t>
-      </w:r>
-      <w:proofErr w:type="gramStart"/>
-      <w:r>
-        <w:rPr>
-          <w:rFonts w:ascii="Arial" w:hAnsi="Arial" w:cs="Arial"/>
-        </w:rPr>
-        <w:t xml:space="preserve">and </w:t>
+        <w:t xml:space="preserve"> future Scope 1 and </w:t>
       </w:r>
       <w:r>
         <w:rPr>
@@ -3938,7 +3901,6 @@
         </w:rPr>
         <w:t>tCO</w:t>
       </w:r>
-      <w:proofErr w:type="gramEnd"/>
       <w:r>
         <w:rPr>
           <w:rFonts w:ascii="Arial" w:hAnsi="Arial" w:cs="Arial"/>
@@ -3950,19 +3912,7 @@
         <w:rPr>
           <w:rFonts w:ascii="Arial" w:hAnsi="Arial" w:cs="Arial"/>
         </w:rPr>
-        <w:t>e emissions (considering only Scope 1 and Scope 2 greenhouse gas emissions)</w:t>
-      </w:r>
-      <w:r>
-        <w:rPr>
-          <w:rFonts w:ascii="Arial" w:hAnsi="Arial" w:cs="Arial"/>
-        </w:rPr>
-        <w:t xml:space="preserve">, </w:t>
-      </w:r>
-      <w:r>
-        <w:rPr>
-          <w:rFonts w:ascii="Arial" w:hAnsi="Arial" w:cs="Arial"/>
-        </w:rPr>
-        <w:t xml:space="preserve">for </w:t>
+        <w:t xml:space="preserve">e emissions (considering only Scope 1 and Scope 2 greenhouse gas emissions), for </w:t>
       </w:r>
       <w:r>
         <w:rPr>
@@ -3985,7 +3935,6 @@
           <w:b/>
           <w:bCs/>
           <w:color w:val="auto"/>
-          <w:lang w:val="pt-BR"/>
         </w:rPr>
       </w:pPr>
       <w:bookmarkStart w:id="5" w:name="_Toc241617507"/>
@@ -3995,7 +3944,6 @@
           <w:b/>
           <w:bCs/>
           <w:color w:val="auto"/>
-          <w:lang w:val="pt-BR"/>
         </w:rPr>
         <w:t>V</w:t>
       </w:r>
@@ -4005,7 +3953,6 @@
           <w:b/>
           <w:bCs/>
           <w:color w:val="auto"/>
-          <w:lang w:val="pt-BR"/>
         </w:rPr>
         <w:t>. Scope</w:t>
       </w:r>
@@ -4075,6 +4022,7 @@
     <w:p>
       <w:pPr>
         <w:pStyle w:val="NormalWeb"/>
+        <w:jc w:val="both"/>
         <w:rPr>
           <w:rFonts w:ascii="Arial" w:hAnsi="Arial" w:cs="Arial"/>
         </w:rPr>
@@ -4192,6 +4140,111 @@
     </w:p>
     <w:p>
       <w:pPr>
+        <w:pStyle w:val="NormalWeb"/>
+        <w:rPr>
+          <w:rFonts w:ascii="Arial" w:hAnsi="Arial" w:cs="Arial"/>
+        </w:rPr>
+      </w:pPr>
+      <w:r>
+        <w:rPr>
+          <w:rFonts w:ascii="Arial" w:hAnsi="Arial" w:cs="Arial"/>
+        </w:rPr>
+        <w:t xml:space="preserve">The project will use a data analysis and predictive modelling approach to investigate whether historical corporate and environmental data can be used to predict future tCO2e emissions at manufacturing companies. </w:t>
+      </w:r>
+      <w:r>
+        <w:rPr>
+          <w:rFonts w:ascii="Arial" w:hAnsi="Arial" w:cs="Arial"/>
+        </w:rPr>
+        <w:t>The methodology to be followed will be as follows:</w:t>
+      </w:r>
+    </w:p>
+    <w:p>
+      <w:pPr>
+        <w:pStyle w:val="NormalWeb"/>
+        <w:numPr>
+          <w:ilvl w:val="0"/>
+          <w:numId w:val="3"/>
+        </w:numPr>
+        <w:rPr>
+          <w:rFonts w:ascii="Arial" w:hAnsi="Arial" w:cs="Arial"/>
+        </w:rPr>
+      </w:pPr>
+      <w:r>
+        <w:rPr>
+          <w:rFonts w:ascii="Arial" w:hAnsi="Arial" w:cs="Arial"/>
+        </w:rPr>
+        <w:t>Data collection and preparation</w:t>
+      </w:r>
+      <w:r>
+        <w:rPr>
+          <w:rFonts w:ascii="Arial" w:hAnsi="Arial" w:cs="Arial"/>
+        </w:rPr>
+        <w:t>.</w:t>
+      </w:r>
+    </w:p>
+    <w:p>
+      <w:pPr>
+        <w:pStyle w:val="NormalWeb"/>
+        <w:ind w:left="720"/>
+        <w:rPr>
+          <w:rFonts w:ascii="Arial" w:hAnsi="Arial" w:cs="Arial"/>
+        </w:rPr>
+      </w:pPr>
+      <w:r>
+        <w:rPr>
+          <w:rFonts w:ascii="Arial" w:hAnsi="Arial" w:cs="Arial"/>
+        </w:rPr>
+        <w:t xml:space="preserve">The data will be cleaned and prepared to identify missing values,  duplicate records or differences in units of measurement. The final selection of </w:t>
+      </w:r>
+      <w:r>
+        <w:rPr>
+          <w:rFonts w:ascii="Arial" w:hAnsi="Arial" w:cs="Arial"/>
+        </w:rPr>
+        <w:lastRenderedPageBreak/>
+        <w:t>variables (such as, revenue or number of employees) will depend on their availability, quality and consistency.</w:t>
+      </w:r>
+    </w:p>
+    <w:p>
+      <w:pPr>
+        <w:pStyle w:val="NormalWeb"/>
+        <w:numPr>
+          <w:ilvl w:val="0"/>
+          <w:numId w:val="3"/>
+        </w:numPr>
+        <w:rPr>
+          <w:rFonts w:ascii="Arial" w:hAnsi="Arial" w:cs="Arial"/>
+        </w:rPr>
+      </w:pPr>
+      <w:r>
+        <w:rPr>
+          <w:rFonts w:ascii="Arial" w:hAnsi="Arial" w:cs="Arial"/>
+        </w:rPr>
+        <w:t xml:space="preserve">Exploratory data analysis. </w:t>
+      </w:r>
+    </w:p>
+    <w:p>
+      <w:pPr>
+        <w:pStyle w:val="NormalWeb"/>
+        <w:ind w:left="720"/>
+        <w:rPr>
+          <w:rFonts w:ascii="Arial" w:hAnsi="Arial" w:cs="Arial"/>
+        </w:rPr>
+      </w:pPr>
+      <w:r>
+        <w:rPr>
+          <w:rFonts w:ascii="Arial" w:hAnsi="Arial" w:cs="Arial"/>
+        </w:rPr>
+        <w:t>An</w:t>
+      </w:r>
+      <w:r>
+        <w:rPr>
+          <w:rFonts w:ascii="Arial" w:hAnsi="Arial" w:cs="Arial"/>
+        </w:rPr>
+        <w:t xml:space="preserve"> exploratory data analysis will be conducted using descriptive statistics, visualization and correlation analysis. The main objective will be to identify patterns in emissions and explore the relationships between emissions and company characteristics. This analysis will also allow us to define the mean, median, standard deviation, minimum and maximum values as well as the identification of missing and outlier values.</w:t>
+      </w:r>
+    </w:p>
+    <w:p>
+      <w:pPr>
         <w:pStyle w:val="Heading2"/>
         <w:rPr>
           <w:rFonts w:ascii="Arial" w:hAnsi="Arial" w:cs="Arial"/>
@@ -4237,6 +4290,149 @@
     </w:p>
     <w:p>
       <w:pPr>
+        <w:pStyle w:val="NormalWeb"/>
+        <w:jc w:val="both"/>
+        <w:rPr>
+          <w:rFonts w:ascii="Arial" w:hAnsi="Arial" w:cs="Arial"/>
+          <w:lang w:val="pt-BR"/>
+        </w:rPr>
+      </w:pPr>
+      <w:r>
+        <w:rPr>
+          <w:rFonts w:ascii="Arial" w:hAnsi="Arial" w:cs="Arial"/>
+        </w:rPr>
+        <w:t>W</w:t>
+      </w:r>
+      <w:r>
+        <w:rPr>
+          <w:rFonts w:ascii="Arial" w:hAnsi="Arial" w:cs="Arial"/>
+        </w:rPr>
+        <w:t xml:space="preserve">e will attempt to obtain information on manufacturing tCO2e emissions from the Mycelium database, </w:t>
+      </w:r>
+      <w:proofErr w:type="spellStart"/>
+      <w:r>
+        <w:rPr>
+          <w:rFonts w:ascii="Arial" w:hAnsi="Arial" w:cs="Arial"/>
+        </w:rPr>
+        <w:t>cuya</w:t>
+      </w:r>
+      <w:proofErr w:type="spellEnd"/>
+      <w:r>
+        <w:rPr>
+          <w:rFonts w:ascii="Arial" w:hAnsi="Arial" w:cs="Arial"/>
+        </w:rPr>
+        <w:t xml:space="preserve"> Plataforma </w:t>
+      </w:r>
+      <w:proofErr w:type="spellStart"/>
+      <w:r>
+        <w:rPr>
+          <w:rFonts w:ascii="Arial" w:hAnsi="Arial" w:cs="Arial"/>
+        </w:rPr>
+        <w:t>tiene</w:t>
+      </w:r>
+      <w:proofErr w:type="spellEnd"/>
+      <w:r>
+        <w:rPr>
+          <w:rFonts w:ascii="Arial" w:hAnsi="Arial" w:cs="Arial"/>
+        </w:rPr>
+        <w:t xml:space="preserve"> </w:t>
+      </w:r>
+      <w:proofErr w:type="spellStart"/>
+      <w:r>
+        <w:rPr>
+          <w:rFonts w:ascii="Arial" w:hAnsi="Arial" w:cs="Arial"/>
+        </w:rPr>
+        <w:t>acceso</w:t>
+      </w:r>
+      <w:proofErr w:type="spellEnd"/>
+      <w:r>
+        <w:rPr>
+          <w:rFonts w:ascii="Arial" w:hAnsi="Arial" w:cs="Arial"/>
+        </w:rPr>
+        <w:t xml:space="preserve"> </w:t>
+      </w:r>
+      <w:proofErr w:type="spellStart"/>
+      <w:r>
+        <w:rPr>
+          <w:rFonts w:ascii="Arial" w:hAnsi="Arial" w:cs="Arial"/>
+        </w:rPr>
+        <w:t>gratuito</w:t>
+      </w:r>
+      <w:proofErr w:type="spellEnd"/>
+      <w:r>
+        <w:rPr>
+          <w:rFonts w:ascii="Arial" w:hAnsi="Arial" w:cs="Arial"/>
+        </w:rPr>
+        <w:t xml:space="preserve"> al API para </w:t>
+      </w:r>
+      <w:proofErr w:type="spellStart"/>
+      <w:r>
+        <w:rPr>
+          <w:rFonts w:ascii="Arial" w:hAnsi="Arial" w:cs="Arial"/>
+        </w:rPr>
+        <w:t>usos</w:t>
+      </w:r>
+      <w:proofErr w:type="spellEnd"/>
+      <w:r>
+        <w:rPr>
+          <w:rFonts w:ascii="Arial" w:hAnsi="Arial" w:cs="Arial"/>
+        </w:rPr>
+        <w:t xml:space="preserve"> </w:t>
+      </w:r>
+      <w:proofErr w:type="spellStart"/>
+      <w:r>
+        <w:rPr>
+          <w:rFonts w:ascii="Arial" w:hAnsi="Arial" w:cs="Arial"/>
+        </w:rPr>
+        <w:t>academicos</w:t>
+      </w:r>
+      <w:proofErr w:type="spellEnd"/>
+      <w:r>
+        <w:rPr>
+          <w:rFonts w:ascii="Arial" w:hAnsi="Arial" w:cs="Arial"/>
+        </w:rPr>
+        <w:t xml:space="preserve">. </w:t>
+      </w:r>
+      <w:r>
+        <w:rPr>
+          <w:rFonts w:ascii="Arial" w:hAnsi="Arial" w:cs="Arial"/>
+          <w:lang w:val="pt-BR"/>
+        </w:rPr>
+        <w:t>La solicitud para el acceso ya fu</w:t>
+      </w:r>
+      <w:r>
+        <w:rPr>
+          <w:rFonts w:ascii="Arial" w:hAnsi="Arial" w:cs="Arial"/>
+          <w:lang w:val="pt-BR"/>
+        </w:rPr>
+        <w:t xml:space="preserve">e enviada y esta en espera de aprobaciòn. Cuando se apruebe el acceso se preneden decargar los datos de varibles adicionales a las emisiones de </w:t>
+      </w:r>
+      <w:r>
+        <w:rPr>
+          <w:rFonts w:ascii="Arial" w:hAnsi="Arial" w:cs="Arial"/>
+          <w:lang w:val="pt-BR"/>
+        </w:rPr>
+        <w:t>tCO2e</w:t>
+      </w:r>
+      <w:r>
+        <w:rPr>
+          <w:rFonts w:ascii="Arial" w:hAnsi="Arial" w:cs="Arial"/>
+          <w:lang w:val="pt-BR"/>
+        </w:rPr>
+        <w:t xml:space="preserve"> como las ventas y numero de emplados para evaluar su influencia sobre las emisiones. </w:t>
+      </w:r>
+    </w:p>
+    <w:p>
+      <w:pPr>
+        <w:pStyle w:val="NormalWeb"/>
+        <w:rPr>
+          <w:rFonts w:ascii="Arial" w:hAnsi="Arial" w:cs="Arial"/>
+          <w:lang w:val="pt-BR"/>
+        </w:rPr>
+      </w:pPr>
+    </w:p>
+    <w:p>
+      <w:pPr>
         <w:pStyle w:val="Heading2"/>
         <w:rPr>
           <w:rFonts w:ascii="Arial" w:hAnsi="Arial" w:cs="Arial"/>
@@ -4253,7 +4449,6 @@
           <w:bCs/>
           <w:color w:val="auto"/>
         </w:rPr>
-        <w:lastRenderedPageBreak/>
         <w:t>VIII</w:t>
       </w:r>
       <w:r>
@@ -4435,6 +4630,7 @@
         <w:rPr>
           <w:rFonts w:ascii="Arial" w:hAnsi="Arial" w:cs="Arial"/>
         </w:rPr>
+        <w:lastRenderedPageBreak/>
         <w:t>Increasing company sales</w:t>
       </w:r>
     </w:p>
@@ -4686,14 +4882,7 @@
                 <w:rPr>
                   <w:noProof/>
                 </w:rPr>
-                <w:t xml:space="preserve"> Retrieved from ARTICLEINFO: https://www.bing.com/ck/a?!&amp;&amp;p=3a2c4c3c80f3c636645997da40ee3de7babee04b043e6f7</w:t>
-              </w:r>
-              <w:r>
-                <w:rPr>
-                  <w:noProof/>
-                </w:rPr>
-                <w:lastRenderedPageBreak/>
-                <w:t>224ecd54831762cc0JmltdHM9MTc5MDg5OTIwMA&amp;ptn=3&amp;ver=2&amp;hsh=4&amp;fclid=08ab4975-cd86-6830-1003-5e52ccfd69e7&amp;psq=Global+Analysis+and+Prediction+of+CO2+and+Greenhouse+Gas+Emissions+acros</w:t>
+                <w:t xml:space="preserve"> Retrieved from ARTICLEINFO: https://www.bing.com/ck/a?!&amp;&amp;p=3a2c4c3c80f3c636645997da40ee3de7babee04b043e6f7224ecd54831762cc0JmltdHM9MTc5MDg5OTIwMA&amp;ptn=3&amp;ver=2&amp;hsh=4&amp;fclid=08ab4975-cd86-6830-1003-5e52ccfd69e7&amp;psq=Global+Analysis+and+Prediction+of+CO2+and+Greenhouse+Gas+Emissions+acros</w:t>
               </w:r>
             </w:p>
             <w:p>
@@ -4850,6 +5039,7 @@
         <w:rPr>
           <w:lang w:val="pt-BR"/>
         </w:rPr>
+        <w:lastRenderedPageBreak/>
         <w:t>t CO2e:</w:t>
       </w:r>
     </w:p>
@@ -5047,6 +5237,95 @@
 <file path=word/numbering.xml><?xml version="1.0" encoding="utf-8"?>
 <w:numbering xmlns:wpc="http://schemas.microsoft.com/office/word/2010/wordprocessingCanvas" xmlns:cx="http://schemas.microsoft.com/office/drawing/2014/chartex" xmlns:cx1="http://schemas.microsoft.com/office/drawing/2015/9/8/chartex" xmlns:cx2="http://schemas.microsoft.com/office/drawing/2015/10/21/chartex" xmlns:cx3="http://schemas.microsoft.com/office/drawing/2016/5/9/chartex" xmlns:cx4="http://schemas.microsoft.com/office/drawing/2016/5/10/chartex" xmlns:cx5="http://schemas.microsoft.com/office/drawing/2016/5/11/chartex" xmlns:cx6="http://schemas.microsoft.com/office/drawing/2016/5/12/chartex" xmlns:cx7="http://schemas.microsoft.com/office/drawing/2016/5/13/chartex" xmlns:cx8="http://schemas.microsoft.com/office/drawing/2016/5/14/chartex" xmlns:mc="http://schemas.openxmlformats.org/markup-compatibility/2006" xmlns:aink="http://schemas.microsoft.com/office/drawing/2016/ink" xmlns:am3d="http://schemas.microsoft.com/office/drawing/2017/model3d" xmlns:o="urn:schemas-microsoft-com:office:office" xmlns:oel="http://schemas.microsoft.com/office/2019/extlst" xmlns:r="http://schemas.openxmlformats.org/officeDocument/2006/relationships" xmlns:m="http://schemas.openxmlformats.org/officeDocument/2006/math" xmlns:v="urn:schemas-microsoft-com:vml" xmlns:wp14="http://schemas.microsoft.com/office/word/2010/wordprocessingDrawing" xmlns:wp="http://schemas.openxmlformats.org/drawingml/2006/wordprocessingDrawing" xmlns:w10="urn:schemas-microsoft-com:office:word" xmlns:w="http://schemas.openxmlformats.org/wordprocessingml/2006/main" xmlns:w14="http://schemas.microsoft.com/office/word/2010/wordml" xmlns:w15="http://schemas.microsoft.com/office/word/2012/wordml" xmlns:w16cex="http://schemas.microsoft.com/office/word/2018/wordml/cex" xmlns:w16cid="http://schemas.microsoft.com/office/word/2016/wordml/cid" xmlns:w16="http://schemas.microsoft.com/office/word/2018/wordml" xmlns:w16du="http://schemas.microsoft.com/office/word/2023/wordml/word16du" xmlns:w16sdtdh="http://schemas.microsoft.com/office/word/2020/wordml/sdtdatahash" xmlns:w16sdtfl="http://schemas.microsoft.com/office/word/2024/wordml/sdtformatlock" xmlns:w16se="http://schemas.microsoft.com/office/word/2015/wordml/symex" xmlns:wpg="http://schemas.microsoft.com/office/word/2010/wordprocessingGroup" xmlns:wpi="http://schemas.microsoft.com/office/word/2010/wordprocessingInk" xmlns:wne="http://schemas.microsoft.com/office/word/2006/wordml" xmlns:wps="http://schemas.microsoft.com/office/word/2010/wordprocessingShape" mc:Ignorable="w14 w15 w16se w16cid w16 w16cex w16sdtdh w16sdtfl w16du wp14">
   <w:abstractNum w:abstractNumId="0" w15:restartNumberingAfterBreak="0">
+    <w:nsid w:val="525A7C15"/>
+    <w:multiLevelType w:val="hybridMultilevel"/>
+    <w:tmpl w:val="6E6EF5C2"/>
+    <w:lvl w:ilvl="0" w:tplc="1809000F">
+      <w:start w:val="1"/>
+      <w:numFmt w:val="decimal"/>
+      <w:lvlText w:val="%1."/>
+      <w:lvlJc w:val="left"/>
+      <w:pPr>
+        <w:ind w:left="720" w:hanging="360"/>
+      </w:pPr>
+      <w:rPr>
+        <w:rFonts w:hint="default"/>
+      </w:rPr>
+    </w:lvl>
+    <w:lvl w:ilvl="1" w:tplc="18090019" w:tentative="1">
+      <w:start w:val="1"/>
+      <w:numFmt w:val="lowerLetter"/>
+      <w:lvlText w:val="%2."/>
+      <w:lvlJc w:val="left"/>
+      <w:pPr>
+        <w:ind w:left="1440" w:hanging="360"/>
+      </w:pPr>
+    </w:lvl>
+    <w:lvl w:ilvl="2" w:tplc="1809001B" w:tentative="1">
+      <w:start w:val="1"/>
+      <w:numFmt w:val="lowerRoman"/>
+      <w:lvlText w:val="%3."/>
+      <w:lvlJc w:val="right"/>
+      <w:pPr>
+        <w:ind w:left="2160" w:hanging="180"/>
+      </w:pPr>
+    </w:lvl>
+    <w:lvl w:ilvl="3" w:tplc="1809000F" w:tentative="1">
+      <w:start w:val="1"/>
+      <w:numFmt w:val="decimal"/>
+      <w:lvlText w:val="%4."/>
+      <w:lvlJc w:val="left"/>
+      <w:pPr>
+        <w:ind w:left="2880" w:hanging="360"/>
+      </w:pPr>
+    </w:lvl>
+    <w:lvl w:ilvl="4" w:tplc="18090019" w:tentative="1">
+      <w:start w:val="1"/>
+      <w:numFmt w:val="lowerLetter"/>
+      <w:lvlText w:val="%5."/>
+      <w:lvlJc w:val="left"/>
+      <w:pPr>
+        <w:ind w:left="3600" w:hanging="360"/>
+      </w:pPr>
+    </w:lvl>
+    <w:lvl w:ilvl="5" w:tplc="1809001B" w:tentative="1">
+      <w:start w:val="1"/>
+      <w:numFmt w:val="lowerRoman"/>
+      <w:lvlText w:val="%6."/>
+      <w:lvlJc w:val="right"/>
+      <w:pPr>
+        <w:ind w:left="4320" w:hanging="180"/>
+      </w:pPr>
+    </w:lvl>
+    <w:lvl w:ilvl="6" w:tplc="1809000F" w:tentative="1">
+      <w:start w:val="1"/>
+      <w:numFmt w:val="decimal"/>
+      <w:lvlText w:val="%7."/>
+      <w:lvlJc w:val="left"/>
+      <w:pPr>
+        <w:ind w:left="5040" w:hanging="360"/>
+      </w:pPr>
+    </w:lvl>
+    <w:lvl w:ilvl="7" w:tplc="18090019" w:tentative="1">
+      <w:start w:val="1"/>
+      <w:numFmt w:val="lowerLetter"/>
+      <w:lvlText w:val="%8."/>
+      <w:lvlJc w:val="left"/>
+      <w:pPr>
+        <w:ind w:left="5760" w:hanging="360"/>
+      </w:pPr>
+    </w:lvl>
+    <w:lvl w:ilvl="8" w:tplc="1809001B" w:tentative="1">
+      <w:start w:val="1"/>
+      <w:numFmt w:val="lowerRoman"/>
+      <w:lvlText w:val="%9."/>
+      <w:lvlJc w:val="right"/>
+      <w:pPr>
+        <w:ind w:left="6480" w:hanging="180"/>
+      </w:pPr>
+    </w:lvl>
+  </w:abstractNum>
+  <w:abstractNum w:abstractNumId="1" w15:restartNumberingAfterBreak="0">
     <w:nsid w:val="60F736BC"/>
     <w:multiLevelType w:val="hybridMultilevel"/>
     <w:tmpl w:val="1A60344A"/>
@@ -5159,7 +5438,7 @@
       </w:rPr>
     </w:lvl>
   </w:abstractNum>
-  <w:abstractNum w:abstractNumId="1" w15:restartNumberingAfterBreak="0">
+  <w:abstractNum w:abstractNumId="2" w15:restartNumberingAfterBreak="0">
     <w:nsid w:val="6B3B0034"/>
     <w:multiLevelType w:val="hybridMultilevel"/>
     <w:tmpl w:val="F7DA2040"/>
@@ -5273,9 +5552,12 @@
     </w:lvl>
   </w:abstractNum>
   <w:num w:numId="1" w16cid:durableId="1579055741">
+    <w:abstractNumId w:val="2"/>
+  </w:num>
+  <w:num w:numId="2" w16cid:durableId="1884246090">
     <w:abstractNumId w:val="1"/>
   </w:num>
-  <w:num w:numId="2" w16cid:durableId="1884246090">
+  <w:num w:numId="3" w16cid:durableId="1107508482">
     <w:abstractNumId w:val="0"/>
   </w:num>
 </w:numbering>
@@ -5934,6 +6216,7 @@
   <w:style w:type="character" w:default="1" w:styleId="DefaultParagraphFont">
     <w:name w:val="Default Paragraph Font"/>
     <w:uiPriority w:val="1"/>
+    <w:semiHidden/>
     <w:unhideWhenUsed/>
   </w:style>
   <w:style w:type="table" w:default="1" w:styleId="TableNormal">

</xml_diff>